<commit_message>
docs(report): fit technical report to 6 pages (verified in Word)
Was 7 pages. Cuts: dropped the bilabial-curves figure (Table 2 carries the
same data), trimmed ~130 words of prose with no numbers removed. Converter:
--uoa12 now sets true single spacing + 6pt after (Word template default
~1.08/8pt wasted ~15% of each page) and 5.2in figure width. Page count
verified at 6 via Word (AppleScript compute statistics).

Co-Authored-By: Claude Fable 5 <noreply@anthropic.com>
</commit_message>
<xml_diff>
--- a/docs/report/DementiaGuide_MidYear_Technical_Report.docx
+++ b/docs/report/DementiaGuide_MidYear_Technical_Report.docx
@@ -150,7 +150,7 @@
           <w:rFonts w:ascii="Times New Roman" w:hAnsi="Times New Roman" w:cs="Times New Roman"/>
           <w:sz w:val="24"/>
         </w:rPr>
-        <w:t xml:space="preserve"> generates the answer under a grounding prompt with inline, validated source citations. The reply is synthesised to speech (ElevenLabs, with Azure and OpenAI fallbacks) and spoken by a Reallusion Character Creator 4 (CC4) avatar rendered in Unity and embedded through a Unity-as-a-Library native bridge; a Three.js WebView renderer is the alternative avatar path. Lip movement is driven by a viseme timeline computed from the spoken text rather than from audio analysis.</w:t>
+        <w:t xml:space="preserve"> generates the answer under a grounding prompt with inline, validated source citations. The reply is synthesised to speech (ElevenLabs, with Azure and OpenAI fallbacks) and spoken by a Reallusion Character Creator 4 (CC4) avatar rendered in Unity through a Unity-as-a-Library native bridge, or by an alternative Three.js WebView renderer. Lip movement is driven by a viseme timeline computed from the spoken text rather than from audio analysis.</w:t>
       </w:r>
     </w:p>
     <w:p>
@@ -162,7 +162,7 @@
           <w:rFonts w:ascii="Times New Roman" w:hAnsi="Times New Roman" w:cs="Times New Roman"/>
           <w:sz w:val="24"/>
         </w:rPr>
-        <w:t>Three subsystems have been evaluated quantitatively at the mid-point: the avatar articulation engine (Section 2), the RAG grounding and safety layer (Section 3), and the end-to-end voice latency after a streaming redesign (Section 4). Section 5 sets out the major steps for the remainder of the project.</w:t>
+        <w:t>Three subsystems have been evaluated quantitatively at the mid-point: the articulation engine (Section 2), the RAG grounding and safety layer (Section 3), and end-to-end voice latency after a streaming redesign (Section 4). Section 5 sets out the major remaining steps.</w:t>
       </w:r>
     </w:p>
     <w:p>
@@ -1332,19 +1332,7 @@
           <w:rFonts w:ascii="Times New Roman" w:hAnsi="Times New Roman" w:cs="Times New Roman"/>
           <w:sz w:val="24"/>
         </w:rPr>
-        <w:t>)) while a closure is dominant, guaranteeing that the lips visibly meet. The engine is pure C# with no engine-state dependency: curves are baked once per utterance and playback is a constant-time frame lookup.</w:t>
-      </w:r>
-    </w:p>
-    <w:p>
-      <w:pPr>
-        <w:jc w:val="both"/>
-      </w:pPr>
-      <w:r>
-        <w:rPr>
-          <w:rFonts w:ascii="Times New Roman" w:hAnsi="Times New Roman" w:cs="Times New Roman"/>
-          <w:sz w:val="24"/>
-        </w:rPr>
-        <w:t>Upstream, a grapheme-to-phoneme (G2P) pipeline replaced per-character heuristics: text is normalised (numbers, currency, abbreviations), converted to ARPAbet phonemes through a lexicon with letter-to-sound rules, and mapped to the avatar's 14 visemes with per-phoneme timing.</w:t>
+        <w:t>)) while a closure is dominant, guaranteeing that the lips visibly meet. Curves are baked once per utterance; playback is a constant-time frame lookup. Upstream, a grapheme-to-phoneme (G2P) pipeline replaced per-character heuristics: text is normalised (numbers, currency, abbreviations), converted to ARPAbet phonemes through a lexicon with letter-to-sound rules, and mapped to the avatar's 14 visemes with per-phoneme timing.</w:t>
       </w:r>
     </w:p>
     <w:p>
@@ -1369,7 +1357,7 @@
           <w:rFonts w:ascii="Times New Roman" w:hAnsi="Times New Roman" w:cs="Times New Roman"/>
           <w:sz w:val="24"/>
         </w:rPr>
-        <w:t>Articulation was evaluated with an automated test loop in the Unity Editor, chosen over visual inspection so that every design iteration could be scored identically and the suite could serve as a standing regression test. The loop plays a fixture through the production message entry point, records all facial blendshape weights each frame (about 90 Hz; 147 to 209 samples per fixture across the two runs), and scores the recording against timed acceptance checks. Eight fixtures embed 95 checks: seven hand-authored ARPAbet utterances covering all 14 visemes and the known difficult cases, and one (</w:t>
+        <w:t>Articulation was evaluated with an automated test loop in the Unity Editor: a fixture plays through the production message entry point, all facial blendshape weights are recorded each frame (about 90 Hz; 147 to 209 samples per fixture), and the recording is scored against timed acceptance checks. Eight fixtures embed 95 checks: seven hand-authored ARPAbet utterances covering all 14 visemes and the known difficult cases, and one (</w:t>
       </w:r>
       <w:r>
         <w:rPr>
@@ -1397,7 +1385,7 @@
           <w:rFonts w:ascii="Times New Roman" w:hAnsi="Times New Roman" w:cs="Times New Roman"/>
           <w:sz w:val="24"/>
         </w:rPr>
-        <w:t xml:space="preserve"> ≥ 0.90 within ±60 ms with open shapes suppressed), labiodental contact (≥ 0.80), tongue activation (≥ 0.30), vowel peak (≥ 0.35), silence (all lip shapes &lt; 0.10), and segment-end decay (&lt; 0.05 within 250 ms). Motion smoothness is additionally reported — the root-mean-square second difference of all curves on a 60 Hz grid ("jitter RMS") — but not gated. The identical suite was run on the baseline pipeline (2026-07-11) and the final pipeline (2026-07-12), giving a controlled before-and-after comparison.</w:t>
+        <w:t xml:space="preserve"> ≥ 0.90 within ±60 ms with open shapes suppressed), labiodental contact (≥ 0.80), tongue activation (≥ 0.30), vowel peak (≥ 0.35), silence (all lip shapes &lt; 0.10), and segment-end decay (&lt; 0.05 within 250 ms). Motion smoothness — the root-mean-square second difference of all curves on a 60 Hz grid ("jitter RMS") — is reported but not gated. The identical suite was run on the baseline pipeline (2026-07-11) and the final pipeline (2026-07-12), giving a controlled before-and-after comparison that also serves as a standing regression test.</w:t>
       </w:r>
     </w:p>
     <w:p>
@@ -1988,7 +1976,7 @@
       <w:r>
         <w:drawing>
           <wp:inline xmlns:a="http://schemas.openxmlformats.org/drawingml/2006/main" xmlns:pic="http://schemas.openxmlformats.org/drawingml/2006/picture">
-            <wp:extent cx="5733288" cy="2734337"/>
+            <wp:extent cx="4754880" cy="2267712"/>
             <wp:docPr id="1" name="Picture 1"/>
             <wp:cNvGraphicFramePr>
               <a:graphicFrameLocks noChangeAspect="1"/>
@@ -2009,7 +1997,7 @@
                   <pic:spPr>
                     <a:xfrm>
                       <a:off x="0" y="0"/>
-                      <a:ext cx="5733288" cy="2734337"/>
+                      <a:ext cx="4754880" cy="2267712"/>
                     </a:xfrm>
                     <a:prstGeom prst="rect"/>
                   </pic:spPr>
@@ -2063,21 +2051,7 @@
           <w:rFonts w:ascii="Times New Roman" w:hAnsi="Times New Roman" w:cs="Times New Roman"/>
           <w:sz w:val="24"/>
         </w:rPr>
-        <w:t xml:space="preserve"> peaks rose from a baseline range of 0.58 to 0.94 to a consistent 0.93 to 0.95, while open-shape leakage during closures fell to at most 0.08 — the combined effect of the guaranteed-contact maximum and the suppression pass. Labiodental peaks rose from a minimum of 0.525 to at least 0.94. All 27 baseline tongue checks measured exactly 0.00 (the tongue shapes were never driven); on the final pipeline every tongue check passed with peaks of 0.40 to 0.72. Pause leakage fell from up to 0.54 to at most 0.10, and end-of-utterance decay fell from 313 to 324 ms down to 30 to 95 ms. Figure 2 traces the mechanism on the </w:t>
-      </w:r>
-      <w:r>
-        <w:rPr>
-          <w:rFonts w:ascii="Consolas" w:hAnsi="Consolas" w:cs="Consolas"/>
-          <w:sz w:val="23"/>
-        </w:rPr>
-        <w:t>bilabials</w:t>
-      </w:r>
-      <w:r>
-        <w:rPr>
-          <w:rFonts w:ascii="Times New Roman" w:hAnsi="Times New Roman" w:cs="Times New Roman"/>
-          <w:sz w:val="24"/>
-        </w:rPr>
-        <w:t xml:space="preserve"> fixture: the closure curve reaches the 0.90 threshold at each /p b m/ instant while the summed open-mouth shapes are suppressed to near zero at the same instants, rising only for the vowels between closures.</w:t>
+        <w:t xml:space="preserve"> peaks rose from a baseline range of 0.58 to 0.94 to a consistent 0.93 to 0.95, while open-shape leakage during closures fell to at most 0.08 — the combined effect of the guaranteed-contact maximum and the suppression pass. Labiodental peaks rose from a minimum of 0.525 to at least 0.94. All 27 baseline tongue checks measured exactly 0.00 (the tongue shapes were never driven); on the final pipeline every tongue check passed with peaks of 0.40 to 0.72. Pause leakage fell from up to 0.54 to at most 0.10, and end-of-utterance decay fell from 313 to 324 ms down to 30 to 95 ms.</w:t>
       </w:r>
     </w:p>
     <w:p>
@@ -2089,7 +2063,7 @@
           <w:rFonts w:ascii="Times New Roman" w:hAnsi="Times New Roman" w:cs="Times New Roman"/>
           <w:sz w:val="24"/>
         </w:rPr>
-        <w:t xml:space="preserve">One metric regressed: jitter RMS increased on every fixture, from a baseline range of 0.0056 to 0.0125 to a final range of 0.0115 to 0.0191 (the </w:t>
+        <w:t>One metric regressed: jitter RMS increased on every fixture, from a baseline range of 0.0056 to 0.0125 to a final range of 0.0115 to 0.0191 (</w:t>
       </w:r>
       <w:r>
         <w:rPr>
@@ -2103,7 +2077,7 @@
           <w:rFonts w:ascii="Times New Roman" w:hAnsi="Times New Roman" w:cs="Times New Roman"/>
           <w:sz w:val="24"/>
         </w:rPr>
-        <w:t xml:space="preserve"> fixture measured 0.0270). No oscillation was visible in the recorded curves; the baseline's lower jitter is consistent with its under-articulation (flatter curves have a smaller second difference), but this interpretation was not isolated experimentally and the regression stands as a finding.</w:t>
+        <w:t>: 0.0270). No oscillation was visible in the recorded curves; the baseline's lower jitter is consistent with its under-articulation (flatter curves have a smaller second difference), but this interpretation was not isolated experimentally and the regression stands as a finding.</w:t>
       </w:r>
     </w:p>
     <w:p>
@@ -2553,93 +2527,6 @@
     </w:p>
     <w:p>
       <w:pPr>
-        <w:jc w:val="center"/>
-      </w:pPr>
-      <w:r>
-        <w:drawing>
-          <wp:inline xmlns:a="http://schemas.openxmlformats.org/drawingml/2006/main" xmlns:pic="http://schemas.openxmlformats.org/drawingml/2006/picture">
-            <wp:extent cx="5733288" cy="2734337"/>
-            <wp:docPr id="2" name="Picture 2"/>
-            <wp:cNvGraphicFramePr>
-              <a:graphicFrameLocks noChangeAspect="1"/>
-            </wp:cNvGraphicFramePr>
-            <a:graphic>
-              <a:graphicData uri="http://schemas.openxmlformats.org/drawingml/2006/picture">
-                <pic:pic>
-                  <pic:nvPicPr>
-                    <pic:cNvPr id="0" name="fig3_bilabial_curves.png"/>
-                    <pic:cNvPicPr/>
-                  </pic:nvPicPr>
-                  <pic:blipFill>
-                    <a:blip r:embed="rId10"/>
-                    <a:stretch>
-                      <a:fillRect/>
-                    </a:stretch>
-                  </pic:blipFill>
-                  <pic:spPr>
-                    <a:xfrm>
-                      <a:off x="0" y="0"/>
-                      <a:ext cx="5733288" cy="2734337"/>
-                    </a:xfrm>
-                    <a:prstGeom prst="rect"/>
-                  </pic:spPr>
-                </pic:pic>
-              </a:graphicData>
-            </a:graphic>
-          </wp:inline>
-        </w:drawing>
-      </w:r>
-    </w:p>
-    <w:p>
-      <w:pPr>
-        <w:jc w:val="center"/>
-      </w:pPr>
-      <w:r>
-        <w:rPr>
-          <w:rFonts w:ascii="Times New Roman" w:hAnsi="Times New Roman" w:cs="Times New Roman"/>
-          <w:b/>
-          <w:sz w:val="20"/>
-        </w:rPr>
-        <w:t>Figure 2.</w:t>
-      </w:r>
-      <w:r>
-        <w:rPr>
-          <w:rFonts w:ascii="Times New Roman" w:hAnsi="Times New Roman" w:cs="Times New Roman"/>
-          <w:sz w:val="20"/>
-        </w:rPr>
-        <w:t xml:space="preserve"> Closure shape </w:t>
-      </w:r>
-      <w:r>
-        <w:rPr>
-          <w:rFonts w:ascii="Consolas" w:hAnsi="Consolas" w:cs="Consolas"/>
-          <w:sz w:val="19"/>
-        </w:rPr>
-        <w:t>V_Explosive</w:t>
-      </w:r>
-      <w:r>
-        <w:rPr>
-          <w:rFonts w:ascii="Times New Roman" w:hAnsi="Times New Roman" w:cs="Times New Roman"/>
-          <w:sz w:val="20"/>
-        </w:rPr>
-        <w:t xml:space="preserve"> over time for the </w:t>
-      </w:r>
-      <w:r>
-        <w:rPr>
-          <w:rFonts w:ascii="Consolas" w:hAnsi="Consolas" w:cs="Consolas"/>
-          <w:sz w:val="19"/>
-        </w:rPr>
-        <w:t>bilabials</w:t>
-      </w:r>
-      <w:r>
-        <w:rPr>
-          <w:rFonts w:ascii="Times New Roman" w:hAnsi="Times New Roman" w:cs="Times New Roman"/>
-          <w:sz w:val="20"/>
-        </w:rPr>
-        <w:t xml:space="preserve"> fixture, baseline versus final, with the summed open-mouth shapes on the final pipeline. The dotted line is the 0.90 acceptance threshold; grey verticals mark the /p b m/ check times.</w:t>
-      </w:r>
-    </w:p>
-    <w:p>
-      <w:pPr>
         <w:jc w:val="both"/>
       </w:pPr>
       <w:r>
@@ -2960,7 +2847,7 @@
           <w:rFonts w:ascii="Times New Roman" w:hAnsi="Times New Roman" w:cs="Times New Roman"/>
           <w:sz w:val="24"/>
         </w:rPr>
-        <w:t xml:space="preserve"> under a New Zealand-specific safety prompt (v2-nz-safety) whose inline citation markers are validated against the passages actually supplied; markers that do not correspond to a supplied passage are stripped before rendering, by construction.</w:t>
+        <w:t xml:space="preserve"> under a New Zealand-specific safety prompt (v2-nz-safety) whose inline citation markers are validated against the passages actually supplied; unmatched markers are stripped before rendering, by construction.</w:t>
       </w:r>
     </w:p>
     <w:p>
@@ -2985,7 +2872,7 @@
           <w:rFonts w:ascii="Times New Roman" w:hAnsi="Times New Roman" w:cs="Times New Roman"/>
           <w:sz w:val="24"/>
         </w:rPr>
-        <w:t>A 42-question caregiver set was used: 32 in-scope questions (29 direct, each labelled with an expected chunk, plus three near-neighbour phrasings), four boundary questions probing unsafe specifics (drug dosing, cure claims, facility recommendations, prognosis), and six out-of-scope questions. Retrieval was scored deterministically (expected chunk identifier within the top five) against the live database. Safety was scored by 36 deterministic MUST/MUST-NOT regular-expression assertions over generations produced at temperature 0 with a fixed seed, covering emergency escalation, dosing, region correctness, crisis response, and prompt-injection resistance. Groundedness was rated by an LLM judge (</w:t>
+        <w:t>A 42-question caregiver set was used: 32 in-scope questions (29 direct, each labelled with an expected chunk, plus three near-neighbour phrasings), four boundary questions probing unsafe specifics (drug dosing, cure claims, facility recommendations, prognosis), and six out-of-scope questions. Retrieval was scored deterministically (expected chunk within the top five) against the live database; safety by 36 deterministic MUST/MUST-NOT regular-expression assertions over generations at temperature 0 with a fixed seed, covering emergency escalation, dosing, region correctness, crisis response, and prompt-injection resistance; groundedness by an LLM judge (</w:t>
       </w:r>
       <w:r>
         <w:rPr>
@@ -2999,7 +2886,7 @@
           <w:rFonts w:ascii="Times New Roman" w:hAnsi="Times New Roman" w:cs="Times New Roman"/>
           <w:sz w:val="24"/>
         </w:rPr>
-        <w:t>, 0/1/2 rubric). A retrieval parameter sweep crossed five similarity thresholds (0.15 to 0.35) with three diversity caps (one to three).</w:t>
+        <w:t>, 0/1/2 rubric). A parameter sweep crossed five similarity thresholds (0.15 to 0.35) with three diversity caps (one to three).</w:t>
       </w:r>
     </w:p>
     <w:p>
@@ -3602,7 +3489,7 @@
           <w:rFonts w:ascii="Times New Roman" w:hAnsi="Times New Roman" w:cs="Times New Roman"/>
           <w:sz w:val="24"/>
         </w:rPr>
-        <w:t xml:space="preserve"> An earlier evaluation on the pre-overhaul corpus found 29 of 32 in-scope questions retrieving their expected chunk; the misses were a corpus-imbalance artefact in which bulk iSupport chunks outranked hand-authored targets (two targets at ranks 6 and 7, one beyond rank 50). Introducing the source-family cap recovered the two competitive targets, raising retrieval to 31 of 32, where it has remained through every subsequent change: the prompt and citation refactors reproduced the frozen baseline ranking exactly, and re-ingesting the corpus (449 to 699 to 551 chunks, as provenance-tracked WHO content was added and 148 unprovenanced chunks were pruned) left recall@5 at 0.969 at each step. The one persistent miss (A17, validation therapy) reflects an uncompetitive curated chunk; its answers were grounded in the topically related iSupport passages retrieved instead.</w:t>
+        <w:t xml:space="preserve"> An earlier evaluation on the pre-overhaul corpus found 29 of 32 in-scope questions retrieving their expected chunk; the misses were a corpus-imbalance artefact in which bulk iSupport chunks outranked hand-authored targets (two at ranks 6 and 7, one beyond rank 50). The source-family cap recovered the two competitive targets, raising retrieval to 31 of 32, where it has remained through every subsequent change: the prompt and citation refactors reproduced the frozen baseline ranking exactly, and re-ingesting the corpus (449 to 551 chunks) left recall@5 at 0.969 at each step. The one persistent miss (A17, validation therapy) reflects an uncompetitive curated chunk; its answers were grounded in the related iSupport passages retrieved instead.</w:t>
       </w:r>
     </w:p>
     <w:p>
@@ -3622,7 +3509,7 @@
           <w:rFonts w:ascii="Times New Roman" w:hAnsi="Times New Roman" w:cs="Times New Roman"/>
           <w:sz w:val="24"/>
         </w:rPr>
-        <w:t xml:space="preserve"> The v1 prompt failed 8 of 36 assertions. All four emergency questions directed a New Zealand user to call 000 — the Australian emergency number — instead of 111; two dosing questions emitted specific milligram values; and three answers cited Australian services. The v2-nz-safety prompt passed 36 of 36, and separately all 32 in-scope generations passed their safety gates. All four boundary questions were declined without the unsupported specific, and all six out-of-scope questions were declined (five retrieved nothing above the similarity floor; the sixth retrieved weak matches but still declined). The curated corpus was subsequently rewritten to be New Zealand-only, and zero Australian references remain in the production database.</w:t>
+        <w:t xml:space="preserve"> The v1 prompt failed 8 of 36 assertions: all four emergency questions directed a New Zealand user to call 000 — the Australian emergency number — instead of 111; two dosing questions emitted specific milligram values; and three answers cited Australian services. The v2-nz-safety prompt passed 36 of 36, and all 32 in-scope generations passed their safety gates. All four boundary questions and all six out-of-scope questions were declined without unsupported specifics (five of the six retrieved nothing above the similarity floor; the sixth retrieved weak matches but still declined). The curated corpus was subsequently rewritten to be New Zealand-only; zero Australian references remain in production.</w:t>
       </w:r>
     </w:p>
     <w:p>
@@ -3642,7 +3529,7 @@
           <w:rFonts w:ascii="Times New Roman" w:hAnsi="Times New Roman" w:cs="Times New Roman"/>
           <w:sz w:val="24"/>
         </w:rPr>
-        <w:t xml:space="preserve"> Under the strict rubric, 23 of 32 answers scored 2 (fully grounded) and nine scored 1; every score-1 case was the judge flagging an accurate helpline or service mention not literally present in the retrieved passages, and none was a fabrication. The two rubric columns in Table 3 are not comparable — the lenient baseline judge scored almost everything 2 and did not discriminate. An independent AI cross-check agreed with the strict judge on 10 of 10 sampled rows, but human sign-off is still pending, so the groundedness figures are indicative rather than validated.</w:t>
+        <w:t xml:space="preserve"> Under the strict rubric, 23 of 32 answers scored 2 (fully grounded) and nine scored 1; every score-1 case was the judge flagging an accurate helpline or service mention not literally present in the retrieved passages — none was a fabrication. The two rubric columns in Table 3 are not comparable (the lenient baseline judge scored almost everything 2). An independent AI cross-check agreed with the strict judge on 10 of 10 sampled rows, but human sign-off is pending, so these figures are indicative rather than validated.</w:t>
       </w:r>
     </w:p>
     <w:p>
@@ -3701,7 +3588,7 @@
           <w:rFonts w:ascii="Times New Roman" w:hAnsi="Times New Roman" w:cs="Times New Roman"/>
           <w:sz w:val="24"/>
         </w:rPr>
-        <w:t xml:space="preserve"> first token, a full first sentence, blocking TTS — yielding roughly 2.2 to 5.5 s from end of speech to first avatar audio. The redesign streams every stage and lets each fall back independently to the previous blocking behaviour. Live on-device transcription replaces the upload (Whisper retained as a rescue path); a speculative retrieval fires while the user is still speaking, once a partial transcript of at least four words has been stable for 600 ms, and its chunks are reused when the final transcript matches lexically (token Jaccard ≥ 0.8, or a prefix with at most 25% growth); the throttle is skipped for voice turns; the TTS WebSocket (</w:t>
+        <w:t xml:space="preserve"> first token, a full first sentence, blocking TTS — yielding roughly 2.2 to 5.5 s from end of speech to first avatar audio. The redesign streams every stage, each falling back independently to the previous blocking behaviour. Live on-device transcription replaces the upload (Whisper retained as a rescue path); a speculative retrieval fires while the user is still speaking, once a partial transcript of at least four words has been stable for 600 ms, with its chunks reused when the final transcript matches lexically (token Jaccard ≥ 0.8, or a prefix with at most 25% growth); the throttle is skipped for voice turns; the TTS WebSocket (</w:t>
       </w:r>
       <w:r>
         <w:rPr>
@@ -3715,7 +3602,7 @@
           <w:rFonts w:ascii="Times New Roman" w:hAnsi="Times New Roman" w:cs="Times New Roman"/>
           <w:sz w:val="24"/>
         </w:rPr>
-        <w:t>, 22.05 kHz PCM) opens concurrently with the LLM request so connection setup hides inside model latency; and on the WebView renderer, audio chunks are scheduled gaplessly with per-chunk character alignment feeding the streaming viseme timeline. The pipeline is instrumented with per-stage checkpoints emitted as a structured summary after every turn.</w:t>
+        <w:t>, 22.05 kHz PCM) opens concurrently with the LLM request so connection setup hides inside model latency; and on the WebView renderer, audio chunks are scheduled gaplessly with per-chunk character alignment feeding the streaming viseme timeline. Per-stage checkpoints are logged after every turn.</w:t>
       </w:r>
     </w:p>
     <w:p>
@@ -4246,7 +4133,7 @@
           <w:rFonts w:ascii="Times New Roman" w:hAnsi="Times New Roman" w:cs="Times New Roman"/>
           <w:sz w:val="24"/>
         </w:rPr>
-        <w:t>Speech-to-text finalisation fell from 700 to 1,500 ms (Whisper upload) to 37 to 181 ms (live recognition), and the removed throttle saves a further 750 ms per turn. After the cold first turn, end-to-end time to first audio was 2.7 to 4.5 s. The remaining cost is dominated by retrieval — 1.5 to 3.5 s, two sequential network round trips (embedding, then vector search) over a mobile radio — and LLM time to first token (0.7 to 1.7 s). The speculative retrieval removes the former when it fires, but quick push-to-talk turns leave no stabilisation window; the hands-free mode's 1.2 s silence endpoint guarantees one. These figures are a preliminary characterisation: four turns on one device and network, on the non-streaming avatar path. The full protocol (at least 10 queries, Wi-Fi and cellular, both renderers) is defined and ready to run.</w:t>
+        <w:t>Speech-to-text finalisation fell from 700 to 1,500 ms (Whisper upload) to 37 to 181 ms (live recognition), and the removed throttle saves a further 750 ms per turn. After the cold first turn, end-to-end time to first audio was 2.7 to 4.5 s. The remaining cost is dominated by retrieval — 1.5 to 3.5 s, two sequential network round trips (embedding, then vector search) over a mobile radio — and LLM time to first token (0.7 to 1.7 s). Speculative retrieval removes the former when it fires, but quick push-to-talk turns leave no stabilisation window; the hands-free mode's 1.2 s silence endpoint guarantees one. These figures are a preliminary characterisation — four turns on one device and network, on the non-streaming avatar path — and the full protocol (at least 10 queries, Wi-Fi and cellular, both renderers) is defined and ready to run.</w:t>
       </w:r>
     </w:p>
     <w:p>
@@ -4279,7 +4166,7 @@
           <w:rFonts w:ascii="Times New Roman" w:hAnsi="Times New Roman" w:cs="Times New Roman"/>
           <w:sz w:val="24"/>
         </w:rPr>
-        <w:t xml:space="preserve"> Caregivers complete representative resource-finding tasks with the avatar interface versus a text-only baseline, measuring task success, time on task, and a standard usability instrument. Requires UAHPEC ethics approval; the protocol is drafted. The component results above validate enabling technology only — the project's accessibility, personalisation, and usability questions can only be answered by this study.</w:t>
+        <w:t xml:space="preserve"> Caregivers complete representative resource-finding tasks with the avatar interface versus a text-only baseline, measuring task success, time on task, and a standard usability instrument (UAHPEC ethics approval required; protocol drafted). The component results above validate enabling technology only — the project's accessibility, personalisation, and usability questions can only be answered by this study.</w:t>
       </w:r>
     </w:p>
     <w:p>
@@ -4299,7 +4186,7 @@
           <w:rFonts w:ascii="Times New Roman" w:hAnsi="Times New Roman" w:cs="Times New Roman"/>
           <w:sz w:val="24"/>
         </w:rPr>
-        <w:t xml:space="preserve"> Execute the defined latency protocol (n ≥ 10, Wi-Fi and cellular) and exercise the full streaming TTS path on the Three.js renderer on-device, measuring sub-sentence first audio, underrun counts, and lip-sync integrity.</w:t>
+        <w:t xml:space="preserve"> Execute the defined latency protocol (n ≥ 10, Wi-Fi and cellular) and exercise the full streaming TTS path on the Three.js renderer on-device, measuring sub-sentence first audio, underruns, and lip-sync integrity.</w:t>
       </w:r>
     </w:p>
     <w:p>
@@ -4319,7 +4206,7 @@
           <w:rFonts w:ascii="Times New Roman" w:hAnsi="Times New Roman" w:cs="Times New Roman"/>
           <w:sz w:val="24"/>
         </w:rPr>
-        <w:t xml:space="preserve"> Move embedding plus vector search into one server-side function to collapse the two sequential mobile round trips — the dominant measured cost (1.5 to 3.5 s) — with an expected reduction to well under 1 s.</w:t>
+        <w:t xml:space="preserve"> Move embedding plus vector search into one server-side function, collapsing the dominant measured cost (1.5 to 3.5 s) to an expected well under 1 s.</w:t>
       </w:r>
     </w:p>
     <w:p>
@@ -4339,7 +4226,7 @@
           <w:rFonts w:ascii="Times New Roman" w:hAnsi="Times New Roman" w:cs="Times New Roman"/>
           <w:sz w:val="24"/>
         </w:rPr>
-        <w:t xml:space="preserve"> Re-run the identical fixture suite through the native bridge on a physical device to confirm the editor metrics hold under real frame timing, and a perceptual study to test whether metric gains correspond to perceived realism.</w:t>
+        <w:t xml:space="preserve"> Re-run the fixture suite through the native bridge on a physical device, plus a perceptual study testing whether the metric gains correspond to perceived realism.</w:t>
       </w:r>
     </w:p>
     <w:p>
@@ -4359,7 +4246,7 @@
           <w:rFonts w:ascii="Times New Roman" w:hAnsi="Times New Roman" w:cs="Times New Roman"/>
           <w:sz w:val="24"/>
         </w:rPr>
-        <w:t xml:space="preserve"> Complete the human review of the strict-judge groundedness scores, and re-ingest the remaining 229 unprovenanced iSupport-NZ chunks from a licensed source document.</w:t>
+        <w:t xml:space="preserve"> Human review of the strict-judge groundedness scores; re-ingest the remaining 229 unprovenanced iSupport-NZ chunks from a licensed source.</w:t>
       </w:r>
     </w:p>
     <w:p>
@@ -4379,7 +4266,7 @@
           <w:rFonts w:ascii="Times New Roman" w:hAnsi="Times New Roman" w:cs="Times New Roman"/>
           <w:sz w:val="24"/>
         </w:rPr>
-        <w:t xml:space="preserve"> Sweep the envelope constants to retain closure guarantees while reducing the jitter regression, and compare the G2P and heuristic paths on identical text to isolate their contributions.</w:t>
+        <w:t xml:space="preserve"> Sweep the envelope constants to retain closure guarantees while reducing jitter, and compare the G2P and heuristic paths on identical text to isolate their contributions.</w:t>
       </w:r>
     </w:p>
     <w:sectPr>
@@ -4755,6 +4642,9 @@
     <w:name w:val="Normal"/>
     <w:qFormat/>
     <w:rsid w:val="00FC693F"/>
+    <w:pPr>
+      <w:spacing w:line="240" w:lineRule="auto" w:after="120"/>
+    </w:pPr>
     <w:rPr>
       <w:rFonts w:ascii="Times New Roman" w:hAnsi="Times New Roman"/>
       <w:sz w:val="24"/>

</xml_diff>

<commit_message>
docs(report): content audit pass — viseme montage figure, char switching, test coverage
Re-adds the viseme montage as Figure 2 (visual-outcome evidence no table
duplicates; 2.3in tall fits the 5.5-page headroom). Mentions the now-shipped
runtime character switching in §1 and the 111-test streaming coverage in §4.
Word-verified still exactly 6 pages. No references list per the P4P handbook
(explicitly excluded for the mid-year report).

Co-Authored-By: Claude Fable 5 <noreply@anthropic.com>
</commit_message>
<xml_diff>
--- a/docs/report/DementiaGuide_MidYear_Technical_Report.docx
+++ b/docs/report/DementiaGuide_MidYear_Technical_Report.docx
@@ -150,7 +150,7 @@
           <w:rFonts w:ascii="Times New Roman" w:hAnsi="Times New Roman" w:cs="Times New Roman"/>
           <w:sz w:val="24"/>
         </w:rPr>
-        <w:t xml:space="preserve"> generates the answer under a grounding prompt with inline, validated source citations. The reply is synthesised to speech (ElevenLabs, with Azure and OpenAI fallbacks) and spoken by a Reallusion Character Creator 4 (CC4) avatar rendered in Unity through a Unity-as-a-Library native bridge, or by an alternative Three.js WebView renderer. Lip movement is driven by a viseme timeline computed from the spoken text rather than from audio analysis.</w:t>
+        <w:t xml:space="preserve"> generates the answer under a grounding prompt with inline, validated source citations. The reply is synthesised to speech (ElevenLabs, with Azure and OpenAI fallbacks) and spoken by one of two Reallusion Character Creator 4 (CC4) characters rendered in Unity through a Unity-as-a-Library native bridge with runtime character switching, or by an alternative Three.js WebView renderer. Lip movement is driven by a viseme timeline computed from the spoken text rather than from audio analysis.</w:t>
       </w:r>
     </w:p>
     <w:p>
@@ -2051,7 +2051,7 @@
           <w:rFonts w:ascii="Times New Roman" w:hAnsi="Times New Roman" w:cs="Times New Roman"/>
           <w:sz w:val="24"/>
         </w:rPr>
-        <w:t xml:space="preserve"> peaks rose from a baseline range of 0.58 to 0.94 to a consistent 0.93 to 0.95, while open-shape leakage during closures fell to at most 0.08 — the combined effect of the guaranteed-contact maximum and the suppression pass. Labiodental peaks rose from a minimum of 0.525 to at least 0.94. All 27 baseline tongue checks measured exactly 0.00 (the tongue shapes were never driven); on the final pipeline every tongue check passed with peaks of 0.40 to 0.72. Pause leakage fell from up to 0.54 to at most 0.10, and end-of-utterance decay fell from 313 to 324 ms down to 30 to 95 ms.</w:t>
+        <w:t xml:space="preserve"> peaks rose from a baseline range of 0.58 to 0.94 to a consistent 0.93 to 0.95, while open-shape leakage during closures fell to at most 0.08 — the combined effect of the guaranteed-contact maximum and the suppression pass. Labiodental peaks rose from a minimum of 0.525 to at least 0.94. All 27 baseline tongue checks measured exactly 0.00 (the tongue shapes were never driven); on the final pipeline every tongue check passed with peaks of 0.40 to 0.72. Pause leakage fell from up to 0.54 to at most 0.10, and end-of-utterance decay fell from 313 to 324 ms down to 30 to 95 ms. Figure 2 shows three of the resulting viseme shapes with their measured weights.</w:t>
       </w:r>
     </w:p>
     <w:p>
@@ -2524,6 +2524,65 @@
       <w:pPr>
         <w:spacing w:after="40"/>
       </w:pPr>
+    </w:p>
+    <w:p>
+      <w:pPr>
+        <w:jc w:val="center"/>
+      </w:pPr>
+      <w:r>
+        <w:drawing>
+          <wp:inline xmlns:a="http://schemas.openxmlformats.org/drawingml/2006/main" xmlns:pic="http://schemas.openxmlformats.org/drawingml/2006/picture">
+            <wp:extent cx="4754880" cy="2079351"/>
+            <wp:docPr id="2" name="Picture 2"/>
+            <wp:cNvGraphicFramePr>
+              <a:graphicFrameLocks noChangeAspect="1"/>
+            </wp:cNvGraphicFramePr>
+            <a:graphic>
+              <a:graphicData uri="http://schemas.openxmlformats.org/drawingml/2006/picture">
+                <pic:pic>
+                  <pic:nvPicPr>
+                    <pic:cNvPr id="0" name="fig2_viseme_montage.png"/>
+                    <pic:cNvPicPr/>
+                  </pic:nvPicPr>
+                  <pic:blipFill>
+                    <a:blip r:embed="rId10"/>
+                    <a:stretch>
+                      <a:fillRect/>
+                    </a:stretch>
+                  </pic:blipFill>
+                  <pic:spPr>
+                    <a:xfrm>
+                      <a:off x="0" y="0"/>
+                      <a:ext cx="4754880" cy="2079351"/>
+                    </a:xfrm>
+                    <a:prstGeom prst="rect"/>
+                  </pic:spPr>
+                </pic:pic>
+              </a:graphicData>
+            </a:graphic>
+          </wp:inline>
+        </w:drawing>
+      </w:r>
+    </w:p>
+    <w:p>
+      <w:pPr>
+        <w:jc w:val="center"/>
+      </w:pPr>
+      <w:r>
+        <w:rPr>
+          <w:rFonts w:ascii="Times New Roman" w:hAnsi="Times New Roman" w:cs="Times New Roman"/>
+          <w:b/>
+          <w:sz w:val="20"/>
+        </w:rPr>
+        <w:t>Figure 2.</w:t>
+      </w:r>
+      <w:r>
+        <w:rPr>
+          <w:rFonts w:ascii="Times New Roman" w:hAnsi="Times New Roman" w:cs="Times New Roman"/>
+          <w:sz w:val="20"/>
+        </w:rPr>
+        <w:t xml:space="preserve"> Viseme shapes produced by the final pipeline (Unity Editor capture): a bilabial closure with sealed lips, an open vowel, and a labiodental lip-to-teeth contact, each annotated with the measured blendshape weight. A like-for-like baseline capture is unavailable because the character was revised in the same change set; the before-and-after comparison is carried quantitatively by Figure 1 and Table 2.</w:t>
+      </w:r>
     </w:p>
     <w:p>
       <w:pPr>
@@ -3602,7 +3661,7 @@
           <w:rFonts w:ascii="Times New Roman" w:hAnsi="Times New Roman" w:cs="Times New Roman"/>
           <w:sz w:val="24"/>
         </w:rPr>
-        <w:t>, 22.05 kHz PCM) opens concurrently with the LLM request so connection setup hides inside model latency; and on the WebView renderer, audio chunks are scheduled gaplessly with per-chunk character alignment feeding the streaming viseme timeline. Per-stage checkpoints are logged after every turn.</w:t>
+        <w:t>, 22.05 kHz PCM) opens concurrently with the LLM request so connection setup hides inside model latency; and on the WebView renderer, audio chunks are scheduled gaplessly with per-chunk character alignment feeding the streaming viseme timeline. Per-stage checkpoints are logged after every turn. The streaming components are covered by 111 unit tests across 12 suites, including parity tests pinning the extracted sentence splitter to the original inline logic and the streaming viseme timeline to its one-shot counterpart.</w:t>
       </w:r>
     </w:p>
     <w:p>

</xml_diff>

<commit_message>
docs(report): adopt P4P template conventions + PDF submission artifact
Per the department template (P4P final report.pdf): centred bold section
headings, numbered display equations (1)-(3) with right-side numbers, Fig. N. /
Table N: caption styles, 165mm print width (20/25mm margins), page numbers
bottom-right except page 1. Dropped the Fig.1 bar chart (duplicated Table 1,
violating the no-table+figure-duplication rule); the viseme montage is now
Fig. 1. Template rules that conflict with the mid-year brief (title page,
declaration, references, double spacing vs the 4-6 page cap) intentionally not
adopted. Word-verified 6 pages; PDF exported via Word (fonts embedded,
text-searchable) as the submission file.

Co-Authored-By: Claude Fable 5 <noreply@anthropic.com>
</commit_message>
<xml_diff>
--- a/docs/report/DementiaGuide_MidYear_Technical_Report.docx
+++ b/docs/report/DementiaGuide_MidYear_Technical_Report.docx
@@ -88,7 +88,8 @@
     </w:p>
     <w:p>
       <w:pPr>
-        <w:spacing w:before="200" w:after="80"/>
+        <w:spacing w:before="140" w:after="80"/>
+        <w:jc w:val="center"/>
       </w:pPr>
       <w:r>
         <w:rPr>
@@ -167,7 +168,8 @@
     </w:p>
     <w:p>
       <w:pPr>
-        <w:spacing w:before="200" w:after="80"/>
+        <w:spacing w:before="140" w:after="80"/>
+        <w:jc w:val="center"/>
       </w:pPr>
       <w:r>
         <w:rPr>
@@ -180,7 +182,7 @@
     </w:p>
     <w:p>
       <w:pPr>
-        <w:spacing w:before="200" w:after="80"/>
+        <w:spacing w:before="140" w:after="80"/>
       </w:pPr>
       <w:r>
         <w:rPr>
@@ -235,14 +237,24 @@
     </w:p>
     <w:p>
       <w:pPr>
-        <w:spacing w:after="120"/>
-        <w:ind w:left="432" w:right="432"/>
+        <w:tabs>
+          <w:tab w:pos="4673" w:val="center"/>
+          <w:tab w:pos="9346" w:val="right"/>
+        </w:tabs>
+        <w:spacing w:before="120" w:after="120"/>
       </w:pPr>
       <w:r>
         <w:rPr>
           <w:rFonts w:ascii="Times New Roman" w:hAnsi="Times New Roman" w:cs="Times New Roman"/>
+          <w:sz w:val="24"/>
+        </w:rPr>
+        <w:tab/>
+      </w:r>
+      <w:r>
+        <w:rPr>
+          <w:rFonts w:ascii="Times New Roman" w:hAnsi="Times New Roman" w:cs="Times New Roman"/>
           <w:i/>
-          <w:sz w:val="22"/>
+          <w:sz w:val="24"/>
         </w:rPr>
         <w:t>D</w:t>
       </w:r>
@@ -250,7 +262,7 @@
         <w:rPr>
           <w:rFonts w:ascii="Times New Roman" w:hAnsi="Times New Roman" w:cs="Times New Roman"/>
           <w:i/>
-          <w:sz w:val="22"/>
+          <w:sz w:val="24"/>
           <w:vertAlign w:val="subscript"/>
         </w:rPr>
         <w:t>i</w:t>
@@ -259,15 +271,14 @@
         <w:rPr>
           <w:rFonts w:ascii="Times New Roman" w:hAnsi="Times New Roman" w:cs="Times New Roman"/>
           <w:i/>
-          <w:sz w:val="22"/>
+          <w:sz w:val="24"/>
         </w:rPr>
         <w:t>(t)</w:t>
       </w:r>
       <w:r>
         <w:rPr>
           <w:rFonts w:ascii="Times New Roman" w:hAnsi="Times New Roman" w:cs="Times New Roman"/>
-          <w:i/>
-          <w:sz w:val="22"/>
+          <w:sz w:val="24"/>
         </w:rPr>
         <w:t xml:space="preserve"> = </w:t>
       </w:r>
@@ -275,15 +286,14 @@
         <w:rPr>
           <w:rFonts w:ascii="Times New Roman" w:hAnsi="Times New Roman" w:cs="Times New Roman"/>
           <w:i/>
-          <w:sz w:val="22"/>
+          <w:sz w:val="24"/>
         </w:rPr>
         <w:t>S</w:t>
       </w:r>
       <w:r>
         <w:rPr>
           <w:rFonts w:ascii="Times New Roman" w:hAnsi="Times New Roman" w:cs="Times New Roman"/>
-          <w:i/>
-          <w:sz w:val="22"/>
+          <w:sz w:val="24"/>
         </w:rPr>
         <w:t>((</w:t>
       </w:r>
@@ -291,15 +301,14 @@
         <w:rPr>
           <w:rFonts w:ascii="Times New Roman" w:hAnsi="Times New Roman" w:cs="Times New Roman"/>
           <w:i/>
-          <w:sz w:val="22"/>
+          <w:sz w:val="24"/>
         </w:rPr>
         <w:t>t</w:t>
       </w:r>
       <w:r>
         <w:rPr>
           <w:rFonts w:ascii="Times New Roman" w:hAnsi="Times New Roman" w:cs="Times New Roman"/>
-          <w:i/>
-          <w:sz w:val="22"/>
+          <w:sz w:val="24"/>
         </w:rPr>
         <w:t xml:space="preserve"> − </w:t>
       </w:r>
@@ -307,7 +316,7 @@
         <w:rPr>
           <w:rFonts w:ascii="Times New Roman" w:hAnsi="Times New Roman" w:cs="Times New Roman"/>
           <w:i/>
-          <w:sz w:val="22"/>
+          <w:sz w:val="24"/>
         </w:rPr>
         <w:t>a</w:t>
       </w:r>
@@ -315,7 +324,7 @@
         <w:rPr>
           <w:rFonts w:ascii="Times New Roman" w:hAnsi="Times New Roman" w:cs="Times New Roman"/>
           <w:i/>
-          <w:sz w:val="22"/>
+          <w:sz w:val="24"/>
           <w:vertAlign w:val="subscript"/>
         </w:rPr>
         <w:t>i</w:t>
@@ -323,8 +332,7 @@
       <w:r>
         <w:rPr>
           <w:rFonts w:ascii="Times New Roman" w:hAnsi="Times New Roman" w:cs="Times New Roman"/>
-          <w:i/>
-          <w:sz w:val="22"/>
+          <w:sz w:val="24"/>
         </w:rPr>
         <w:t>)/(</w:t>
       </w:r>
@@ -332,7 +340,7 @@
         <w:rPr>
           <w:rFonts w:ascii="Times New Roman" w:hAnsi="Times New Roman" w:cs="Times New Roman"/>
           <w:i/>
-          <w:sz w:val="22"/>
+          <w:sz w:val="24"/>
         </w:rPr>
         <w:t>p</w:t>
       </w:r>
@@ -340,7 +348,7 @@
         <w:rPr>
           <w:rFonts w:ascii="Times New Roman" w:hAnsi="Times New Roman" w:cs="Times New Roman"/>
           <w:i/>
-          <w:sz w:val="22"/>
+          <w:sz w:val="24"/>
           <w:vertAlign w:val="subscript"/>
         </w:rPr>
         <w:t>i</w:t>
@@ -348,8 +356,7 @@
       <w:r>
         <w:rPr>
           <w:rFonts w:ascii="Times New Roman" w:hAnsi="Times New Roman" w:cs="Times New Roman"/>
-          <w:i/>
-          <w:sz w:val="22"/>
+          <w:sz w:val="24"/>
         </w:rPr>
         <w:t xml:space="preserve"> − </w:t>
       </w:r>
@@ -357,7 +364,7 @@
         <w:rPr>
           <w:rFonts w:ascii="Times New Roman" w:hAnsi="Times New Roman" w:cs="Times New Roman"/>
           <w:i/>
-          <w:sz w:val="22"/>
+          <w:sz w:val="24"/>
         </w:rPr>
         <w:t>a</w:t>
       </w:r>
@@ -365,7 +372,7 @@
         <w:rPr>
           <w:rFonts w:ascii="Times New Roman" w:hAnsi="Times New Roman" w:cs="Times New Roman"/>
           <w:i/>
-          <w:sz w:val="22"/>
+          <w:sz w:val="24"/>
           <w:vertAlign w:val="subscript"/>
         </w:rPr>
         <w:t>i</w:t>
@@ -373,8 +380,7 @@
       <w:r>
         <w:rPr>
           <w:rFonts w:ascii="Times New Roman" w:hAnsi="Times New Roman" w:cs="Times New Roman"/>
-          <w:i/>
-          <w:sz w:val="22"/>
+          <w:sz w:val="24"/>
         </w:rPr>
         <w:t xml:space="preserve">)) for </w:t>
       </w:r>
@@ -382,7 +388,7 @@
         <w:rPr>
           <w:rFonts w:ascii="Times New Roman" w:hAnsi="Times New Roman" w:cs="Times New Roman"/>
           <w:i/>
-          <w:sz w:val="22"/>
+          <w:sz w:val="24"/>
         </w:rPr>
         <w:t>a</w:t>
       </w:r>
@@ -390,7 +396,7 @@
         <w:rPr>
           <w:rFonts w:ascii="Times New Roman" w:hAnsi="Times New Roman" w:cs="Times New Roman"/>
           <w:i/>
-          <w:sz w:val="22"/>
+          <w:sz w:val="24"/>
           <w:vertAlign w:val="subscript"/>
         </w:rPr>
         <w:t>i</w:t>
@@ -398,8 +404,7 @@
       <w:r>
         <w:rPr>
           <w:rFonts w:ascii="Times New Roman" w:hAnsi="Times New Roman" w:cs="Times New Roman"/>
-          <w:i/>
-          <w:sz w:val="22"/>
+          <w:sz w:val="24"/>
         </w:rPr>
         <w:t xml:space="preserve"> &lt; </w:t>
       </w:r>
@@ -407,15 +412,14 @@
         <w:rPr>
           <w:rFonts w:ascii="Times New Roman" w:hAnsi="Times New Roman" w:cs="Times New Roman"/>
           <w:i/>
-          <w:sz w:val="22"/>
+          <w:sz w:val="24"/>
         </w:rPr>
         <w:t>t</w:t>
       </w:r>
       <w:r>
         <w:rPr>
           <w:rFonts w:ascii="Times New Roman" w:hAnsi="Times New Roman" w:cs="Times New Roman"/>
-          <w:i/>
-          <w:sz w:val="22"/>
+          <w:sz w:val="24"/>
         </w:rPr>
         <w:t xml:space="preserve"> &lt; </w:t>
       </w:r>
@@ -423,7 +427,7 @@
         <w:rPr>
           <w:rFonts w:ascii="Times New Roman" w:hAnsi="Times New Roman" w:cs="Times New Roman"/>
           <w:i/>
-          <w:sz w:val="22"/>
+          <w:sz w:val="24"/>
         </w:rPr>
         <w:t>p</w:t>
       </w:r>
@@ -431,7 +435,7 @@
         <w:rPr>
           <w:rFonts w:ascii="Times New Roman" w:hAnsi="Times New Roman" w:cs="Times New Roman"/>
           <w:i/>
-          <w:sz w:val="22"/>
+          <w:sz w:val="24"/>
           <w:vertAlign w:val="subscript"/>
         </w:rPr>
         <w:t>i</w:t>
@@ -439,8 +443,7 @@
       <w:r>
         <w:rPr>
           <w:rFonts w:ascii="Times New Roman" w:hAnsi="Times New Roman" w:cs="Times New Roman"/>
-          <w:i/>
-          <w:sz w:val="22"/>
+          <w:sz w:val="24"/>
         </w:rPr>
         <w:t xml:space="preserve">;  1 for </w:t>
       </w:r>
@@ -448,7 +451,7 @@
         <w:rPr>
           <w:rFonts w:ascii="Times New Roman" w:hAnsi="Times New Roman" w:cs="Times New Roman"/>
           <w:i/>
-          <w:sz w:val="22"/>
+          <w:sz w:val="24"/>
         </w:rPr>
         <w:t>p</w:t>
       </w:r>
@@ -456,7 +459,7 @@
         <w:rPr>
           <w:rFonts w:ascii="Times New Roman" w:hAnsi="Times New Roman" w:cs="Times New Roman"/>
           <w:i/>
-          <w:sz w:val="22"/>
+          <w:sz w:val="24"/>
           <w:vertAlign w:val="subscript"/>
         </w:rPr>
         <w:t>i</w:t>
@@ -464,8 +467,7 @@
       <w:r>
         <w:rPr>
           <w:rFonts w:ascii="Times New Roman" w:hAnsi="Times New Roman" w:cs="Times New Roman"/>
-          <w:i/>
-          <w:sz w:val="22"/>
+          <w:sz w:val="24"/>
         </w:rPr>
         <w:t xml:space="preserve"> ≤ </w:t>
       </w:r>
@@ -473,15 +475,14 @@
         <w:rPr>
           <w:rFonts w:ascii="Times New Roman" w:hAnsi="Times New Roman" w:cs="Times New Roman"/>
           <w:i/>
-          <w:sz w:val="22"/>
+          <w:sz w:val="24"/>
         </w:rPr>
         <w:t>t</w:t>
       </w:r>
       <w:r>
         <w:rPr>
           <w:rFonts w:ascii="Times New Roman" w:hAnsi="Times New Roman" w:cs="Times New Roman"/>
-          <w:i/>
-          <w:sz w:val="22"/>
+          <w:sz w:val="24"/>
         </w:rPr>
         <w:t xml:space="preserve"> ≤ </w:t>
       </w:r>
@@ -489,7 +490,7 @@
         <w:rPr>
           <w:rFonts w:ascii="Times New Roman" w:hAnsi="Times New Roman" w:cs="Times New Roman"/>
           <w:i/>
-          <w:sz w:val="22"/>
+          <w:sz w:val="24"/>
         </w:rPr>
         <w:t>s</w:t>
       </w:r>
@@ -497,7 +498,7 @@
         <w:rPr>
           <w:rFonts w:ascii="Times New Roman" w:hAnsi="Times New Roman" w:cs="Times New Roman"/>
           <w:i/>
-          <w:sz w:val="22"/>
+          <w:sz w:val="24"/>
           <w:vertAlign w:val="subscript"/>
         </w:rPr>
         <w:t>i</w:t>
@@ -505,8 +506,7 @@
       <w:r>
         <w:rPr>
           <w:rFonts w:ascii="Times New Roman" w:hAnsi="Times New Roman" w:cs="Times New Roman"/>
-          <w:i/>
-          <w:sz w:val="22"/>
+          <w:sz w:val="24"/>
         </w:rPr>
         <w:t xml:space="preserve">;  1 − </w:t>
       </w:r>
@@ -514,15 +514,14 @@
         <w:rPr>
           <w:rFonts w:ascii="Times New Roman" w:hAnsi="Times New Roman" w:cs="Times New Roman"/>
           <w:i/>
-          <w:sz w:val="22"/>
+          <w:sz w:val="24"/>
         </w:rPr>
         <w:t>S</w:t>
       </w:r>
       <w:r>
         <w:rPr>
           <w:rFonts w:ascii="Times New Roman" w:hAnsi="Times New Roman" w:cs="Times New Roman"/>
-          <w:i/>
-          <w:sz w:val="22"/>
+          <w:sz w:val="24"/>
         </w:rPr>
         <w:t>((</w:t>
       </w:r>
@@ -530,15 +529,14 @@
         <w:rPr>
           <w:rFonts w:ascii="Times New Roman" w:hAnsi="Times New Roman" w:cs="Times New Roman"/>
           <w:i/>
-          <w:sz w:val="22"/>
+          <w:sz w:val="24"/>
         </w:rPr>
         <w:t>t</w:t>
       </w:r>
       <w:r>
         <w:rPr>
           <w:rFonts w:ascii="Times New Roman" w:hAnsi="Times New Roman" w:cs="Times New Roman"/>
-          <w:i/>
-          <w:sz w:val="22"/>
+          <w:sz w:val="24"/>
         </w:rPr>
         <w:t xml:space="preserve"> − </w:t>
       </w:r>
@@ -546,7 +544,7 @@
         <w:rPr>
           <w:rFonts w:ascii="Times New Roman" w:hAnsi="Times New Roman" w:cs="Times New Roman"/>
           <w:i/>
-          <w:sz w:val="22"/>
+          <w:sz w:val="24"/>
         </w:rPr>
         <w:t>s</w:t>
       </w:r>
@@ -554,7 +552,7 @@
         <w:rPr>
           <w:rFonts w:ascii="Times New Roman" w:hAnsi="Times New Roman" w:cs="Times New Roman"/>
           <w:i/>
-          <w:sz w:val="22"/>
+          <w:sz w:val="24"/>
           <w:vertAlign w:val="subscript"/>
         </w:rPr>
         <w:t>i</w:t>
@@ -562,8 +560,7 @@
       <w:r>
         <w:rPr>
           <w:rFonts w:ascii="Times New Roman" w:hAnsi="Times New Roman" w:cs="Times New Roman"/>
-          <w:i/>
-          <w:sz w:val="22"/>
+          <w:sz w:val="24"/>
         </w:rPr>
         <w:t>)/(</w:t>
       </w:r>
@@ -571,7 +568,7 @@
         <w:rPr>
           <w:rFonts w:ascii="Times New Roman" w:hAnsi="Times New Roman" w:cs="Times New Roman"/>
           <w:i/>
-          <w:sz w:val="22"/>
+          <w:sz w:val="24"/>
         </w:rPr>
         <w:t>f</w:t>
       </w:r>
@@ -579,7 +576,7 @@
         <w:rPr>
           <w:rFonts w:ascii="Times New Roman" w:hAnsi="Times New Roman" w:cs="Times New Roman"/>
           <w:i/>
-          <w:sz w:val="22"/>
+          <w:sz w:val="24"/>
           <w:vertAlign w:val="subscript"/>
         </w:rPr>
         <w:t>i</w:t>
@@ -587,8 +584,7 @@
       <w:r>
         <w:rPr>
           <w:rFonts w:ascii="Times New Roman" w:hAnsi="Times New Roman" w:cs="Times New Roman"/>
-          <w:i/>
-          <w:sz w:val="22"/>
+          <w:sz w:val="24"/>
         </w:rPr>
         <w:t xml:space="preserve"> − </w:t>
       </w:r>
@@ -596,7 +592,7 @@
         <w:rPr>
           <w:rFonts w:ascii="Times New Roman" w:hAnsi="Times New Roman" w:cs="Times New Roman"/>
           <w:i/>
-          <w:sz w:val="22"/>
+          <w:sz w:val="24"/>
         </w:rPr>
         <w:t>s</w:t>
       </w:r>
@@ -604,7 +600,7 @@
         <w:rPr>
           <w:rFonts w:ascii="Times New Roman" w:hAnsi="Times New Roman" w:cs="Times New Roman"/>
           <w:i/>
-          <w:sz w:val="22"/>
+          <w:sz w:val="24"/>
           <w:vertAlign w:val="subscript"/>
         </w:rPr>
         <w:t>i</w:t>
@@ -612,8 +608,7 @@
       <w:r>
         <w:rPr>
           <w:rFonts w:ascii="Times New Roman" w:hAnsi="Times New Roman" w:cs="Times New Roman"/>
-          <w:i/>
-          <w:sz w:val="22"/>
+          <w:sz w:val="24"/>
         </w:rPr>
         <w:t xml:space="preserve">)) for </w:t>
       </w:r>
@@ -621,7 +616,7 @@
         <w:rPr>
           <w:rFonts w:ascii="Times New Roman" w:hAnsi="Times New Roman" w:cs="Times New Roman"/>
           <w:i/>
-          <w:sz w:val="22"/>
+          <w:sz w:val="24"/>
         </w:rPr>
         <w:t>s</w:t>
       </w:r>
@@ -629,7 +624,7 @@
         <w:rPr>
           <w:rFonts w:ascii="Times New Roman" w:hAnsi="Times New Roman" w:cs="Times New Roman"/>
           <w:i/>
-          <w:sz w:val="22"/>
+          <w:sz w:val="24"/>
           <w:vertAlign w:val="subscript"/>
         </w:rPr>
         <w:t>i</w:t>
@@ -637,8 +632,7 @@
       <w:r>
         <w:rPr>
           <w:rFonts w:ascii="Times New Roman" w:hAnsi="Times New Roman" w:cs="Times New Roman"/>
-          <w:i/>
-          <w:sz w:val="22"/>
+          <w:sz w:val="24"/>
         </w:rPr>
         <w:t xml:space="preserve"> &lt; </w:t>
       </w:r>
@@ -646,15 +640,14 @@
         <w:rPr>
           <w:rFonts w:ascii="Times New Roman" w:hAnsi="Times New Roman" w:cs="Times New Roman"/>
           <w:i/>
-          <w:sz w:val="22"/>
+          <w:sz w:val="24"/>
         </w:rPr>
         <w:t>t</w:t>
       </w:r>
       <w:r>
         <w:rPr>
           <w:rFonts w:ascii="Times New Roman" w:hAnsi="Times New Roman" w:cs="Times New Roman"/>
-          <w:i/>
-          <w:sz w:val="22"/>
+          <w:sz w:val="24"/>
         </w:rPr>
         <w:t xml:space="preserve"> &lt; </w:t>
       </w:r>
@@ -662,7 +655,7 @@
         <w:rPr>
           <w:rFonts w:ascii="Times New Roman" w:hAnsi="Times New Roman" w:cs="Times New Roman"/>
           <w:i/>
-          <w:sz w:val="22"/>
+          <w:sz w:val="24"/>
         </w:rPr>
         <w:t>f</w:t>
       </w:r>
@@ -670,7 +663,7 @@
         <w:rPr>
           <w:rFonts w:ascii="Times New Roman" w:hAnsi="Times New Roman" w:cs="Times New Roman"/>
           <w:i/>
-          <w:sz w:val="22"/>
+          <w:sz w:val="24"/>
           <w:vertAlign w:val="subscript"/>
         </w:rPr>
         <w:t>i</w:t>
@@ -678,10 +671,17 @@
       <w:r>
         <w:rPr>
           <w:rFonts w:ascii="Times New Roman" w:hAnsi="Times New Roman" w:cs="Times New Roman"/>
-          <w:i/>
-          <w:sz w:val="22"/>
+          <w:sz w:val="24"/>
         </w:rPr>
-        <w:t>;  0 otherwise,</w:t>
+        <w:t>;  0 otherwise</w:t>
+      </w:r>
+      <w:r>
+        <w:rPr>
+          <w:rFonts w:ascii="Times New Roman" w:hAnsi="Times New Roman" w:cs="Times New Roman"/>
+          <w:sz w:val="24"/>
+        </w:rPr>
+        <w:tab/>
+        <w:t>(1)</w:t>
       </w:r>
     </w:p>
     <w:p>
@@ -899,14 +899,24 @@
     </w:p>
     <w:p>
       <w:pPr>
-        <w:spacing w:after="120"/>
-        <w:ind w:left="432" w:right="432"/>
+        <w:tabs>
+          <w:tab w:pos="4673" w:val="center"/>
+          <w:tab w:pos="9346" w:val="right"/>
+        </w:tabs>
+        <w:spacing w:before="120" w:after="120"/>
       </w:pPr>
       <w:r>
         <w:rPr>
           <w:rFonts w:ascii="Times New Roman" w:hAnsi="Times New Roman" w:cs="Times New Roman"/>
+          <w:sz w:val="24"/>
+        </w:rPr>
+        <w:tab/>
+      </w:r>
+      <w:r>
+        <w:rPr>
+          <w:rFonts w:ascii="Times New Roman" w:hAnsi="Times New Roman" w:cs="Times New Roman"/>
           <w:i/>
-          <w:sz w:val="22"/>
+          <w:sz w:val="24"/>
         </w:rPr>
         <w:t>w</w:t>
       </w:r>
@@ -914,7 +924,7 @@
         <w:rPr>
           <w:rFonts w:ascii="Times New Roman" w:hAnsi="Times New Roman" w:cs="Times New Roman"/>
           <w:i/>
-          <w:sz w:val="22"/>
+          <w:sz w:val="24"/>
           <w:vertAlign w:val="subscript"/>
         </w:rPr>
         <w:t>s</w:t>
@@ -922,8 +932,7 @@
       <w:r>
         <w:rPr>
           <w:rFonts w:ascii="Times New Roman" w:hAnsi="Times New Roman" w:cs="Times New Roman"/>
-          <w:i/>
-          <w:sz w:val="22"/>
+          <w:sz w:val="24"/>
         </w:rPr>
         <w:t>(</w:t>
       </w:r>
@@ -931,15 +940,14 @@
         <w:rPr>
           <w:rFonts w:ascii="Times New Roman" w:hAnsi="Times New Roman" w:cs="Times New Roman"/>
           <w:i/>
-          <w:sz w:val="22"/>
+          <w:sz w:val="24"/>
         </w:rPr>
         <w:t>t</w:t>
       </w:r>
       <w:r>
         <w:rPr>
           <w:rFonts w:ascii="Times New Roman" w:hAnsi="Times New Roman" w:cs="Times New Roman"/>
-          <w:i/>
-          <w:sz w:val="22"/>
+          <w:sz w:val="24"/>
         </w:rPr>
         <w:t>) = Σ&lt;sub&gt;</w:t>
       </w:r>
@@ -947,15 +955,14 @@
         <w:rPr>
           <w:rFonts w:ascii="Times New Roman" w:hAnsi="Times New Roman" w:cs="Times New Roman"/>
           <w:i/>
-          <w:sz w:val="22"/>
+          <w:sz w:val="24"/>
         </w:rPr>
         <w:t>i</w:t>
       </w:r>
       <w:r>
         <w:rPr>
           <w:rFonts w:ascii="Times New Roman" w:hAnsi="Times New Roman" w:cs="Times New Roman"/>
-          <w:i/>
-          <w:sz w:val="22"/>
+          <w:sz w:val="24"/>
         </w:rPr>
         <w:t xml:space="preserve">&lt;/sub&gt; </w:t>
       </w:r>
@@ -963,7 +970,7 @@
         <w:rPr>
           <w:rFonts w:ascii="Times New Roman" w:hAnsi="Times New Roman" w:cs="Times New Roman"/>
           <w:i/>
-          <w:sz w:val="22"/>
+          <w:sz w:val="24"/>
         </w:rPr>
         <w:t>D</w:t>
       </w:r>
@@ -971,7 +978,7 @@
         <w:rPr>
           <w:rFonts w:ascii="Times New Roman" w:hAnsi="Times New Roman" w:cs="Times New Roman"/>
           <w:i/>
-          <w:sz w:val="22"/>
+          <w:sz w:val="24"/>
           <w:vertAlign w:val="subscript"/>
         </w:rPr>
         <w:t>i</w:t>
@@ -979,8 +986,7 @@
       <w:r>
         <w:rPr>
           <w:rFonts w:ascii="Times New Roman" w:hAnsi="Times New Roman" w:cs="Times New Roman"/>
-          <w:i/>
-          <w:sz w:val="22"/>
+          <w:sz w:val="24"/>
         </w:rPr>
         <w:t>(</w:t>
       </w:r>
@@ -988,23 +994,21 @@
         <w:rPr>
           <w:rFonts w:ascii="Times New Roman" w:hAnsi="Times New Roman" w:cs="Times New Roman"/>
           <w:i/>
-          <w:sz w:val="22"/>
+          <w:sz w:val="24"/>
         </w:rPr>
         <w:t>t</w:t>
       </w:r>
       <w:r>
         <w:rPr>
           <w:rFonts w:ascii="Times New Roman" w:hAnsi="Times New Roman" w:cs="Times New Roman"/>
-          <w:i/>
-          <w:sz w:val="22"/>
+          <w:sz w:val="24"/>
         </w:rPr>
         <w:t>)</w:t>
       </w:r>
       <w:r>
         <w:rPr>
           <w:rFonts w:ascii="Times New Roman" w:hAnsi="Times New Roman" w:cs="Times New Roman"/>
-          <w:i/>
-          <w:sz w:val="22"/>
+          <w:sz w:val="24"/>
           <w:vertAlign w:val="superscript"/>
         </w:rPr>
         <w:t>ρ</w:t>
@@ -1012,8 +1016,7 @@
       <w:r>
         <w:rPr>
           <w:rFonts w:ascii="Times New Roman" w:hAnsi="Times New Roman" w:cs="Times New Roman"/>
-          <w:i/>
-          <w:sz w:val="22"/>
+          <w:sz w:val="24"/>
         </w:rPr>
         <w:t xml:space="preserve"> · τ&lt;sub&gt;</w:t>
       </w:r>
@@ -1021,15 +1024,14 @@
         <w:rPr>
           <w:rFonts w:ascii="Times New Roman" w:hAnsi="Times New Roman" w:cs="Times New Roman"/>
           <w:i/>
-          <w:sz w:val="22"/>
+          <w:sz w:val="24"/>
         </w:rPr>
         <w:t>i</w:t>
       </w:r>
       <w:r>
         <w:rPr>
           <w:rFonts w:ascii="Times New Roman" w:hAnsi="Times New Roman" w:cs="Times New Roman"/>
-          <w:i/>
-          <w:sz w:val="22"/>
+          <w:sz w:val="24"/>
         </w:rPr>
         <w:t>,</w:t>
       </w:r>
@@ -1037,15 +1039,14 @@
         <w:rPr>
           <w:rFonts w:ascii="Times New Roman" w:hAnsi="Times New Roman" w:cs="Times New Roman"/>
           <w:i/>
-          <w:sz w:val="22"/>
+          <w:sz w:val="24"/>
         </w:rPr>
         <w:t>s</w:t>
       </w:r>
       <w:r>
         <w:rPr>
           <w:rFonts w:ascii="Times New Roman" w:hAnsi="Times New Roman" w:cs="Times New Roman"/>
-          <w:i/>
-          <w:sz w:val="22"/>
+          <w:sz w:val="24"/>
         </w:rPr>
         <w:t>&lt;/sub&gt; / max(Σ&lt;sub&gt;</w:t>
       </w:r>
@@ -1053,15 +1054,14 @@
         <w:rPr>
           <w:rFonts w:ascii="Times New Roman" w:hAnsi="Times New Roman" w:cs="Times New Roman"/>
           <w:i/>
-          <w:sz w:val="22"/>
+          <w:sz w:val="24"/>
         </w:rPr>
         <w:t>i</w:t>
       </w:r>
       <w:r>
         <w:rPr>
           <w:rFonts w:ascii="Times New Roman" w:hAnsi="Times New Roman" w:cs="Times New Roman"/>
-          <w:i/>
-          <w:sz w:val="22"/>
+          <w:sz w:val="24"/>
         </w:rPr>
         <w:t xml:space="preserve">&lt;/sub&gt; </w:t>
       </w:r>
@@ -1069,7 +1069,7 @@
         <w:rPr>
           <w:rFonts w:ascii="Times New Roman" w:hAnsi="Times New Roman" w:cs="Times New Roman"/>
           <w:i/>
-          <w:sz w:val="22"/>
+          <w:sz w:val="24"/>
         </w:rPr>
         <w:t>D</w:t>
       </w:r>
@@ -1077,7 +1077,7 @@
         <w:rPr>
           <w:rFonts w:ascii="Times New Roman" w:hAnsi="Times New Roman" w:cs="Times New Roman"/>
           <w:i/>
-          <w:sz w:val="22"/>
+          <w:sz w:val="24"/>
           <w:vertAlign w:val="subscript"/>
         </w:rPr>
         <w:t>i</w:t>
@@ -1085,8 +1085,7 @@
       <w:r>
         <w:rPr>
           <w:rFonts w:ascii="Times New Roman" w:hAnsi="Times New Roman" w:cs="Times New Roman"/>
-          <w:i/>
-          <w:sz w:val="22"/>
+          <w:sz w:val="24"/>
         </w:rPr>
         <w:t>(</w:t>
       </w:r>
@@ -1094,23 +1093,21 @@
         <w:rPr>
           <w:rFonts w:ascii="Times New Roman" w:hAnsi="Times New Roman" w:cs="Times New Roman"/>
           <w:i/>
-          <w:sz w:val="22"/>
+          <w:sz w:val="24"/>
         </w:rPr>
         <w:t>t</w:t>
       </w:r>
       <w:r>
         <w:rPr>
           <w:rFonts w:ascii="Times New Roman" w:hAnsi="Times New Roman" w:cs="Times New Roman"/>
-          <w:i/>
-          <w:sz w:val="22"/>
+          <w:sz w:val="24"/>
         </w:rPr>
         <w:t>)</w:t>
       </w:r>
       <w:r>
         <w:rPr>
           <w:rFonts w:ascii="Times New Roman" w:hAnsi="Times New Roman" w:cs="Times New Roman"/>
-          <w:i/>
-          <w:sz w:val="22"/>
+          <w:sz w:val="24"/>
           <w:vertAlign w:val="superscript"/>
         </w:rPr>
         <w:t>ρ</w:t>
@@ -1118,10 +1115,17 @@
       <w:r>
         <w:rPr>
           <w:rFonts w:ascii="Times New Roman" w:hAnsi="Times New Roman" w:cs="Times New Roman"/>
-          <w:i/>
-          <w:sz w:val="22"/>
+          <w:sz w:val="24"/>
         </w:rPr>
-        <w:t>, 1),</w:t>
+        <w:t>, 1)</w:t>
+      </w:r>
+      <w:r>
+        <w:rPr>
+          <w:rFonts w:ascii="Times New Roman" w:hAnsi="Times New Roman" w:cs="Times New Roman"/>
+          <w:sz w:val="24"/>
+        </w:rPr>
+        <w:tab/>
+        <w:t>(2)</w:t>
       </w:r>
     </w:p>
     <w:p>
@@ -1337,7 +1341,7 @@
     </w:p>
     <w:p>
       <w:pPr>
-        <w:spacing w:before="200" w:after="80"/>
+        <w:spacing w:before="140" w:after="80"/>
       </w:pPr>
       <w:r>
         <w:rPr>
@@ -1385,12 +1389,12 @@
           <w:rFonts w:ascii="Times New Roman" w:hAnsi="Times New Roman" w:cs="Times New Roman"/>
           <w:sz w:val="24"/>
         </w:rPr>
-        <w:t xml:space="preserve"> ≥ 0.90 within ±60 ms with open shapes suppressed), labiodental contact (≥ 0.80), tongue activation (≥ 0.30), vowel peak (≥ 0.35), silence (all lip shapes &lt; 0.10), and segment-end decay (&lt; 0.05 within 250 ms). Motion smoothness — the root-mean-square second difference of all curves on a 60 Hz grid ("jitter RMS") — is reported but not gated. The identical suite was run on the baseline pipeline (2026-07-11) and the final pipeline (2026-07-12), giving a controlled before-and-after comparison that also serves as a standing regression test.</w:t>
+        <w:t xml:space="preserve"> ≥ 0.90 within ±60 ms with open shapes suppressed), labiodental contact (≥ 0.80), tongue activation (≥ 0.30), vowel peak (≥ 0.35), silence (all lip shapes &lt; 0.10), and segment-end decay (&lt; 0.05 within 250 ms). Motion smoothness — the root-mean-square second difference of all curves on a 60 Hz grid ("jitter RMS") — is reported but not gated. The identical suite was run on the baseline (2026-07-11) and final (2026-07-12) pipelines, giving a controlled before-and-after comparison that doubles as a regression test.</w:t>
       </w:r>
     </w:p>
     <w:p>
       <w:pPr>
-        <w:spacing w:before="200" w:after="80"/>
+        <w:spacing w:before="140" w:after="80"/>
       </w:pPr>
       <w:r>
         <w:rPr>
@@ -1424,7 +1428,7 @@
           <w:rFonts w:ascii="Times New Roman" w:hAnsi="Times New Roman" w:cs="Times New Roman"/>
           <w:sz w:val="24"/>
         </w:rPr>
-        <w:t xml:space="preserve"> fixture passed all 10 of its checks, giving 95 of 95 (Table 1, Figure 1). Every fixture improved, with the largest absolute gain in </w:t>
+        <w:t xml:space="preserve"> fixture passed all 10 of its checks, giving 95 of 95 (Table 1). Every fixture improved; the largest gain was </w:t>
       </w:r>
       <w:r>
         <w:rPr>
@@ -1451,7 +1455,7 @@
           <w:b/>
           <w:sz w:val="20"/>
         </w:rPr>
-        <w:t>Table 1.</w:t>
+        <w:t>Table 1:</w:t>
       </w:r>
       <w:r>
         <w:rPr>
@@ -1483,14 +1487,14 @@
         <w:tblLook w:firstColumn="1" w:firstRow="1" w:lastColumn="0" w:lastRow="0" w:noHBand="0" w:noVBand="1" w:val="04A0"/>
       </w:tblPr>
       <w:tblGrid>
-        <w:gridCol w:w="3009"/>
-        <w:gridCol w:w="3009"/>
-        <w:gridCol w:w="3009"/>
+        <w:gridCol w:w="3118"/>
+        <w:gridCol w:w="3118"/>
+        <w:gridCol w:w="3118"/>
       </w:tblGrid>
       <w:tr>
         <w:tc>
           <w:tcPr>
-            <w:tcW w:type="dxa" w:w="3009"/>
+            <w:tcW w:type="dxa" w:w="3118"/>
           </w:tcPr>
           <w:p>
             <w:r/>
@@ -1506,7 +1510,7 @@
         </w:tc>
         <w:tc>
           <w:tcPr>
-            <w:tcW w:type="dxa" w:w="3009"/>
+            <w:tcW w:type="dxa" w:w="3118"/>
           </w:tcPr>
           <w:p>
             <w:r/>
@@ -1522,7 +1526,7 @@
         </w:tc>
         <w:tc>
           <w:tcPr>
-            <w:tcW w:type="dxa" w:w="3009"/>
+            <w:tcW w:type="dxa" w:w="3118"/>
           </w:tcPr>
           <w:p>
             <w:r/>
@@ -1540,7 +1544,7 @@
       <w:tr>
         <w:tc>
           <w:tcPr>
-            <w:tcW w:type="dxa" w:w="3009"/>
+            <w:tcW w:type="dxa" w:w="3118"/>
           </w:tcPr>
           <w:p>
             <w:r/>
@@ -1555,7 +1559,7 @@
         </w:tc>
         <w:tc>
           <w:tcPr>
-            <w:tcW w:type="dxa" w:w="3009"/>
+            <w:tcW w:type="dxa" w:w="3118"/>
           </w:tcPr>
           <w:p>
             <w:r/>
@@ -1570,7 +1574,7 @@
         </w:tc>
         <w:tc>
           <w:tcPr>
-            <w:tcW w:type="dxa" w:w="3009"/>
+            <w:tcW w:type="dxa" w:w="3118"/>
           </w:tcPr>
           <w:p>
             <w:r/>
@@ -1587,7 +1591,7 @@
       <w:tr>
         <w:tc>
           <w:tcPr>
-            <w:tcW w:type="dxa" w:w="3009"/>
+            <w:tcW w:type="dxa" w:w="3118"/>
           </w:tcPr>
           <w:p>
             <w:r/>
@@ -1602,7 +1606,7 @@
         </w:tc>
         <w:tc>
           <w:tcPr>
-            <w:tcW w:type="dxa" w:w="3009"/>
+            <w:tcW w:type="dxa" w:w="3118"/>
           </w:tcPr>
           <w:p>
             <w:r/>
@@ -1617,7 +1621,7 @@
         </w:tc>
         <w:tc>
           <w:tcPr>
-            <w:tcW w:type="dxa" w:w="3009"/>
+            <w:tcW w:type="dxa" w:w="3118"/>
           </w:tcPr>
           <w:p>
             <w:r/>
@@ -1634,7 +1638,7 @@
       <w:tr>
         <w:tc>
           <w:tcPr>
-            <w:tcW w:type="dxa" w:w="3009"/>
+            <w:tcW w:type="dxa" w:w="3118"/>
           </w:tcPr>
           <w:p>
             <w:r/>
@@ -1649,7 +1653,7 @@
         </w:tc>
         <w:tc>
           <w:tcPr>
-            <w:tcW w:type="dxa" w:w="3009"/>
+            <w:tcW w:type="dxa" w:w="3118"/>
           </w:tcPr>
           <w:p>
             <w:r/>
@@ -1664,7 +1668,7 @@
         </w:tc>
         <w:tc>
           <w:tcPr>
-            <w:tcW w:type="dxa" w:w="3009"/>
+            <w:tcW w:type="dxa" w:w="3118"/>
           </w:tcPr>
           <w:p>
             <w:r/>
@@ -1681,7 +1685,7 @@
       <w:tr>
         <w:tc>
           <w:tcPr>
-            <w:tcW w:type="dxa" w:w="3009"/>
+            <w:tcW w:type="dxa" w:w="3118"/>
           </w:tcPr>
           <w:p>
             <w:r/>
@@ -1696,7 +1700,7 @@
         </w:tc>
         <w:tc>
           <w:tcPr>
-            <w:tcW w:type="dxa" w:w="3009"/>
+            <w:tcW w:type="dxa" w:w="3118"/>
           </w:tcPr>
           <w:p>
             <w:r/>
@@ -1711,7 +1715,7 @@
         </w:tc>
         <w:tc>
           <w:tcPr>
-            <w:tcW w:type="dxa" w:w="3009"/>
+            <w:tcW w:type="dxa" w:w="3118"/>
           </w:tcPr>
           <w:p>
             <w:r/>
@@ -1728,7 +1732,7 @@
       <w:tr>
         <w:tc>
           <w:tcPr>
-            <w:tcW w:type="dxa" w:w="3009"/>
+            <w:tcW w:type="dxa" w:w="3118"/>
           </w:tcPr>
           <w:p>
             <w:r/>
@@ -1743,7 +1747,7 @@
         </w:tc>
         <w:tc>
           <w:tcPr>
-            <w:tcW w:type="dxa" w:w="3009"/>
+            <w:tcW w:type="dxa" w:w="3118"/>
           </w:tcPr>
           <w:p>
             <w:r/>
@@ -1758,7 +1762,7 @@
         </w:tc>
         <w:tc>
           <w:tcPr>
-            <w:tcW w:type="dxa" w:w="3009"/>
+            <w:tcW w:type="dxa" w:w="3118"/>
           </w:tcPr>
           <w:p>
             <w:r/>
@@ -1775,7 +1779,7 @@
       <w:tr>
         <w:tc>
           <w:tcPr>
-            <w:tcW w:type="dxa" w:w="3009"/>
+            <w:tcW w:type="dxa" w:w="3118"/>
           </w:tcPr>
           <w:p>
             <w:r/>
@@ -1790,7 +1794,7 @@
         </w:tc>
         <w:tc>
           <w:tcPr>
-            <w:tcW w:type="dxa" w:w="3009"/>
+            <w:tcW w:type="dxa" w:w="3118"/>
           </w:tcPr>
           <w:p>
             <w:r/>
@@ -1805,7 +1809,7 @@
         </w:tc>
         <w:tc>
           <w:tcPr>
-            <w:tcW w:type="dxa" w:w="3009"/>
+            <w:tcW w:type="dxa" w:w="3118"/>
           </w:tcPr>
           <w:p>
             <w:r/>
@@ -1822,7 +1826,7 @@
       <w:tr>
         <w:tc>
           <w:tcPr>
-            <w:tcW w:type="dxa" w:w="3009"/>
+            <w:tcW w:type="dxa" w:w="3118"/>
           </w:tcPr>
           <w:p>
             <w:r/>
@@ -1837,7 +1841,7 @@
         </w:tc>
         <w:tc>
           <w:tcPr>
-            <w:tcW w:type="dxa" w:w="3009"/>
+            <w:tcW w:type="dxa" w:w="3118"/>
           </w:tcPr>
           <w:p>
             <w:r/>
@@ -1852,7 +1856,7 @@
         </w:tc>
         <w:tc>
           <w:tcPr>
-            <w:tcW w:type="dxa" w:w="3009"/>
+            <w:tcW w:type="dxa" w:w="3118"/>
           </w:tcPr>
           <w:p>
             <w:r/>
@@ -1869,7 +1873,7 @@
       <w:tr>
         <w:tc>
           <w:tcPr>
-            <w:tcW w:type="dxa" w:w="3009"/>
+            <w:tcW w:type="dxa" w:w="3118"/>
           </w:tcPr>
           <w:p>
             <w:r/>
@@ -1884,7 +1888,7 @@
         </w:tc>
         <w:tc>
           <w:tcPr>
-            <w:tcW w:type="dxa" w:w="3009"/>
+            <w:tcW w:type="dxa" w:w="3118"/>
           </w:tcPr>
           <w:p>
             <w:r/>
@@ -1899,7 +1903,7 @@
         </w:tc>
         <w:tc>
           <w:tcPr>
-            <w:tcW w:type="dxa" w:w="3009"/>
+            <w:tcW w:type="dxa" w:w="3118"/>
           </w:tcPr>
           <w:p>
             <w:r/>
@@ -1916,7 +1920,7 @@
       <w:tr>
         <w:tc>
           <w:tcPr>
-            <w:tcW w:type="dxa" w:w="3009"/>
+            <w:tcW w:type="dxa" w:w="3118"/>
           </w:tcPr>
           <w:p>
             <w:r/>
@@ -1932,7 +1936,7 @@
         </w:tc>
         <w:tc>
           <w:tcPr>
-            <w:tcW w:type="dxa" w:w="3009"/>
+            <w:tcW w:type="dxa" w:w="3118"/>
           </w:tcPr>
           <w:p>
             <w:r/>
@@ -1948,7 +1952,7 @@
         </w:tc>
         <w:tc>
           <w:tcPr>
-            <w:tcW w:type="dxa" w:w="3009"/>
+            <w:tcW w:type="dxa" w:w="3118"/>
           </w:tcPr>
           <w:p>
             <w:r/>
@@ -1968,65 +1972,6 @@
       <w:pPr>
         <w:spacing w:after="40"/>
       </w:pPr>
-    </w:p>
-    <w:p>
-      <w:pPr>
-        <w:jc w:val="center"/>
-      </w:pPr>
-      <w:r>
-        <w:drawing>
-          <wp:inline xmlns:a="http://schemas.openxmlformats.org/drawingml/2006/main" xmlns:pic="http://schemas.openxmlformats.org/drawingml/2006/picture">
-            <wp:extent cx="4754880" cy="2267712"/>
-            <wp:docPr id="1" name="Picture 1"/>
-            <wp:cNvGraphicFramePr>
-              <a:graphicFrameLocks noChangeAspect="1"/>
-            </wp:cNvGraphicFramePr>
-            <a:graphic>
-              <a:graphicData uri="http://schemas.openxmlformats.org/drawingml/2006/picture">
-                <pic:pic>
-                  <pic:nvPicPr>
-                    <pic:cNvPr id="0" name="fig1_checks_passed.png"/>
-                    <pic:cNvPicPr/>
-                  </pic:nvPicPr>
-                  <pic:blipFill>
-                    <a:blip r:embed="rId9"/>
-                    <a:stretch>
-                      <a:fillRect/>
-                    </a:stretch>
-                  </pic:blipFill>
-                  <pic:spPr>
-                    <a:xfrm>
-                      <a:off x="0" y="0"/>
-                      <a:ext cx="4754880" cy="2267712"/>
-                    </a:xfrm>
-                    <a:prstGeom prst="rect"/>
-                  </pic:spPr>
-                </pic:pic>
-              </a:graphicData>
-            </a:graphic>
-          </wp:inline>
-        </w:drawing>
-      </w:r>
-    </w:p>
-    <w:p>
-      <w:pPr>
-        <w:jc w:val="center"/>
-      </w:pPr>
-      <w:r>
-        <w:rPr>
-          <w:rFonts w:ascii="Times New Roman" w:hAnsi="Times New Roman" w:cs="Times New Roman"/>
-          <w:b/>
-          <w:sz w:val="20"/>
-        </w:rPr>
-        <w:t>Figure 1.</w:t>
-      </w:r>
-      <w:r>
-        <w:rPr>
-          <w:rFonts w:ascii="Times New Roman" w:hAnsi="Times New Roman" w:cs="Times New Roman"/>
-          <w:sz w:val="20"/>
-        </w:rPr>
-        <w:t xml:space="preserve"> Acceptance checks passed per fixture on the baseline and final pipelines. The light backdrop bar is the total number of checks in each fixture.</w:t>
-      </w:r>
     </w:p>
     <w:p>
       <w:pPr>
@@ -2051,7 +1996,7 @@
           <w:rFonts w:ascii="Times New Roman" w:hAnsi="Times New Roman" w:cs="Times New Roman"/>
           <w:sz w:val="24"/>
         </w:rPr>
-        <w:t xml:space="preserve"> peaks rose from a baseline range of 0.58 to 0.94 to a consistent 0.93 to 0.95, while open-shape leakage during closures fell to at most 0.08 — the combined effect of the guaranteed-contact maximum and the suppression pass. Labiodental peaks rose from a minimum of 0.525 to at least 0.94. All 27 baseline tongue checks measured exactly 0.00 (the tongue shapes were never driven); on the final pipeline every tongue check passed with peaks of 0.40 to 0.72. Pause leakage fell from up to 0.54 to at most 0.10, and end-of-utterance decay fell from 313 to 324 ms down to 30 to 95 ms. Figure 2 shows three of the resulting viseme shapes with their measured weights.</w:t>
+        <w:t xml:space="preserve"> peaks rose from a baseline range of 0.58 to 0.94 to a consistent 0.93 to 0.95, while open-shape leakage during closures fell to at most 0.08 — the combined effect of the guaranteed-contact maximum and the suppression pass. Labiodental peaks rose from a minimum of 0.525 to at least 0.94. All 27 baseline tongue checks measured exactly 0.00; on the final pipeline all passed with peaks of 0.40 to 0.72. Pause leakage fell from up to 0.54 to at most 0.10, and end-of-utterance decay fell from 313 to 324 ms down to 30 to 95 ms. Fig. 1 shows three of the resulting viseme shapes with their measured weights.</w:t>
       </w:r>
     </w:p>
     <w:p>
@@ -2077,7 +2022,7 @@
           <w:rFonts w:ascii="Times New Roman" w:hAnsi="Times New Roman" w:cs="Times New Roman"/>
           <w:sz w:val="24"/>
         </w:rPr>
-        <w:t>: 0.0270). No oscillation was visible in the recorded curves; the baseline's lower jitter is consistent with its under-articulation (flatter curves have a smaller second difference), but this interpretation was not isolated experimentally and the regression stands as a finding.</w:t>
+        <w:t>: 0.0270). No oscillation was visible in the recorded curves; the baseline's lower jitter is consistent with its under-articulation (flatter curves have a smaller second difference), but this was not isolated experimentally and the regression stands.</w:t>
       </w:r>
     </w:p>
     <w:p>
@@ -2090,7 +2035,7 @@
           <w:b/>
           <w:sz w:val="20"/>
         </w:rPr>
-        <w:t>Table 2.</w:t>
+        <w:t>Table 2:</w:t>
       </w:r>
       <w:r>
         <w:rPr>
@@ -2108,14 +2053,14 @@
         <w:tblLook w:firstColumn="1" w:firstRow="1" w:lastColumn="0" w:lastRow="0" w:noHBand="0" w:noVBand="1" w:val="04A0"/>
       </w:tblPr>
       <w:tblGrid>
-        <w:gridCol w:w="3009"/>
-        <w:gridCol w:w="3009"/>
-        <w:gridCol w:w="3009"/>
+        <w:gridCol w:w="3118"/>
+        <w:gridCol w:w="3118"/>
+        <w:gridCol w:w="3118"/>
       </w:tblGrid>
       <w:tr>
         <w:tc>
           <w:tcPr>
-            <w:tcW w:type="dxa" w:w="3009"/>
+            <w:tcW w:type="dxa" w:w="3118"/>
           </w:tcPr>
           <w:p>
             <w:r/>
@@ -2131,7 +2076,7 @@
         </w:tc>
         <w:tc>
           <w:tcPr>
-            <w:tcW w:type="dxa" w:w="3009"/>
+            <w:tcW w:type="dxa" w:w="3118"/>
           </w:tcPr>
           <w:p>
             <w:r/>
@@ -2147,7 +2092,7 @@
         </w:tc>
         <w:tc>
           <w:tcPr>
-            <w:tcW w:type="dxa" w:w="3009"/>
+            <w:tcW w:type="dxa" w:w="3118"/>
           </w:tcPr>
           <w:p>
             <w:r/>
@@ -2165,7 +2110,7 @@
       <w:tr>
         <w:tc>
           <w:tcPr>
-            <w:tcW w:type="dxa" w:w="3009"/>
+            <w:tcW w:type="dxa" w:w="3118"/>
           </w:tcPr>
           <w:p>
             <w:r/>
@@ -2194,7 +2139,7 @@
         </w:tc>
         <w:tc>
           <w:tcPr>
-            <w:tcW w:type="dxa" w:w="3009"/>
+            <w:tcW w:type="dxa" w:w="3118"/>
           </w:tcPr>
           <w:p>
             <w:r/>
@@ -2209,7 +2154,7 @@
         </w:tc>
         <w:tc>
           <w:tcPr>
-            <w:tcW w:type="dxa" w:w="3009"/>
+            <w:tcW w:type="dxa" w:w="3118"/>
           </w:tcPr>
           <w:p>
             <w:r/>
@@ -2226,7 +2171,7 @@
       <w:tr>
         <w:tc>
           <w:tcPr>
-            <w:tcW w:type="dxa" w:w="3009"/>
+            <w:tcW w:type="dxa" w:w="3118"/>
           </w:tcPr>
           <w:p>
             <w:r/>
@@ -2241,7 +2186,7 @@
         </w:tc>
         <w:tc>
           <w:tcPr>
-            <w:tcW w:type="dxa" w:w="3009"/>
+            <w:tcW w:type="dxa" w:w="3118"/>
           </w:tcPr>
           <w:p>
             <w:r/>
@@ -2256,7 +2201,7 @@
         </w:tc>
         <w:tc>
           <w:tcPr>
-            <w:tcW w:type="dxa" w:w="3009"/>
+            <w:tcW w:type="dxa" w:w="3118"/>
           </w:tcPr>
           <w:p>
             <w:r/>
@@ -2273,7 +2218,7 @@
       <w:tr>
         <w:tc>
           <w:tcPr>
-            <w:tcW w:type="dxa" w:w="3009"/>
+            <w:tcW w:type="dxa" w:w="3118"/>
           </w:tcPr>
           <w:p>
             <w:r/>
@@ -2302,7 +2247,7 @@
         </w:tc>
         <w:tc>
           <w:tcPr>
-            <w:tcW w:type="dxa" w:w="3009"/>
+            <w:tcW w:type="dxa" w:w="3118"/>
           </w:tcPr>
           <w:p>
             <w:r/>
@@ -2317,7 +2262,7 @@
         </w:tc>
         <w:tc>
           <w:tcPr>
-            <w:tcW w:type="dxa" w:w="3009"/>
+            <w:tcW w:type="dxa" w:w="3118"/>
           </w:tcPr>
           <w:p>
             <w:r/>
@@ -2334,7 +2279,7 @@
       <w:tr>
         <w:tc>
           <w:tcPr>
-            <w:tcW w:type="dxa" w:w="3009"/>
+            <w:tcW w:type="dxa" w:w="3118"/>
           </w:tcPr>
           <w:p>
             <w:r/>
@@ -2349,7 +2294,7 @@
         </w:tc>
         <w:tc>
           <w:tcPr>
-            <w:tcW w:type="dxa" w:w="3009"/>
+            <w:tcW w:type="dxa" w:w="3118"/>
           </w:tcPr>
           <w:p>
             <w:r/>
@@ -2364,7 +2309,7 @@
         </w:tc>
         <w:tc>
           <w:tcPr>
-            <w:tcW w:type="dxa" w:w="3009"/>
+            <w:tcW w:type="dxa" w:w="3118"/>
           </w:tcPr>
           <w:p>
             <w:r/>
@@ -2381,7 +2326,7 @@
       <w:tr>
         <w:tc>
           <w:tcPr>
-            <w:tcW w:type="dxa" w:w="3009"/>
+            <w:tcW w:type="dxa" w:w="3118"/>
           </w:tcPr>
           <w:p>
             <w:r/>
@@ -2396,7 +2341,7 @@
         </w:tc>
         <w:tc>
           <w:tcPr>
-            <w:tcW w:type="dxa" w:w="3009"/>
+            <w:tcW w:type="dxa" w:w="3118"/>
           </w:tcPr>
           <w:p>
             <w:r/>
@@ -2411,7 +2356,7 @@
         </w:tc>
         <w:tc>
           <w:tcPr>
-            <w:tcW w:type="dxa" w:w="3009"/>
+            <w:tcW w:type="dxa" w:w="3118"/>
           </w:tcPr>
           <w:p>
             <w:r/>
@@ -2428,7 +2373,7 @@
       <w:tr>
         <w:tc>
           <w:tcPr>
-            <w:tcW w:type="dxa" w:w="3009"/>
+            <w:tcW w:type="dxa" w:w="3118"/>
           </w:tcPr>
           <w:p>
             <w:r/>
@@ -2443,7 +2388,7 @@
         </w:tc>
         <w:tc>
           <w:tcPr>
-            <w:tcW w:type="dxa" w:w="3009"/>
+            <w:tcW w:type="dxa" w:w="3118"/>
           </w:tcPr>
           <w:p>
             <w:r/>
@@ -2458,7 +2403,7 @@
         </w:tc>
         <w:tc>
           <w:tcPr>
-            <w:tcW w:type="dxa" w:w="3009"/>
+            <w:tcW w:type="dxa" w:w="3118"/>
           </w:tcPr>
           <w:p>
             <w:r/>
@@ -2475,7 +2420,7 @@
       <w:tr>
         <w:tc>
           <w:tcPr>
-            <w:tcW w:type="dxa" w:w="3009"/>
+            <w:tcW w:type="dxa" w:w="3118"/>
           </w:tcPr>
           <w:p>
             <w:r/>
@@ -2490,7 +2435,7 @@
         </w:tc>
         <w:tc>
           <w:tcPr>
-            <w:tcW w:type="dxa" w:w="3009"/>
+            <w:tcW w:type="dxa" w:w="3118"/>
           </w:tcPr>
           <w:p>
             <w:r/>
@@ -2505,7 +2450,7 @@
         </w:tc>
         <w:tc>
           <w:tcPr>
-            <w:tcW w:type="dxa" w:w="3009"/>
+            <w:tcW w:type="dxa" w:w="3118"/>
           </w:tcPr>
           <w:p>
             <w:r/>
@@ -2532,8 +2477,8 @@
       <w:r>
         <w:drawing>
           <wp:inline xmlns:a="http://schemas.openxmlformats.org/drawingml/2006/main" xmlns:pic="http://schemas.openxmlformats.org/drawingml/2006/picture">
-            <wp:extent cx="4754880" cy="2079351"/>
-            <wp:docPr id="2" name="Picture 2"/>
+            <wp:extent cx="4480560" cy="1959389"/>
+            <wp:docPr id="1" name="Picture 1"/>
             <wp:cNvGraphicFramePr>
               <a:graphicFrameLocks noChangeAspect="1"/>
             </wp:cNvGraphicFramePr>
@@ -2553,7 +2498,7 @@
                   <pic:spPr>
                     <a:xfrm>
                       <a:off x="0" y="0"/>
-                      <a:ext cx="4754880" cy="2079351"/>
+                      <a:ext cx="4480560" cy="1959389"/>
                     </a:xfrm>
                     <a:prstGeom prst="rect"/>
                   </pic:spPr>
@@ -2574,14 +2519,14 @@
           <w:b/>
           <w:sz w:val="20"/>
         </w:rPr>
-        <w:t>Figure 2.</w:t>
+        <w:t>Fig. 1.</w:t>
       </w:r>
       <w:r>
         <w:rPr>
           <w:rFonts w:ascii="Times New Roman" w:hAnsi="Times New Roman" w:cs="Times New Roman"/>
           <w:sz w:val="20"/>
         </w:rPr>
-        <w:t xml:space="preserve"> Viseme shapes produced by the final pipeline (Unity Editor capture): a bilabial closure with sealed lips, an open vowel, and a labiodental lip-to-teeth contact, each annotated with the measured blendshape weight. A like-for-like baseline capture is unavailable because the character was revised in the same change set; the before-and-after comparison is carried quantitatively by Figure 1 and Table 2.</w:t>
+        <w:t xml:space="preserve"> Viseme shapes produced by the final pipeline (Unity Editor capture): a bilabial closure with sealed lips, an open vowel, and a labiodental lip-to-teeth contact, each annotated with the measured blendshape weight. A like-for-like baseline capture is unavailable (the character was revised in the same change set); the quantitative comparison is carried by Tables 1 and 2.</w:t>
       </w:r>
     </w:p>
     <w:p>
@@ -2598,7 +2543,8 @@
     </w:p>
     <w:p>
       <w:pPr>
-        <w:spacing w:before="200" w:after="80"/>
+        <w:spacing w:before="140" w:after="80"/>
+        <w:jc w:val="center"/>
       </w:pPr>
       <w:r>
         <w:rPr>
@@ -2611,7 +2557,7 @@
     </w:p>
     <w:p>
       <w:pPr>
-        <w:spacing w:before="200" w:after="80"/>
+        <w:spacing w:before="140" w:after="80"/>
       </w:pPr>
       <w:r>
         <w:rPr>
@@ -2723,14 +2669,23 @@
     </w:p>
     <w:p>
       <w:pPr>
-        <w:spacing w:after="120"/>
-        <w:ind w:left="432" w:right="432"/>
+        <w:tabs>
+          <w:tab w:pos="4673" w:val="center"/>
+          <w:tab w:pos="9346" w:val="right"/>
+        </w:tabs>
+        <w:spacing w:before="120" w:after="120"/>
       </w:pPr>
       <w:r>
         <w:rPr>
           <w:rFonts w:ascii="Times New Roman" w:hAnsi="Times New Roman" w:cs="Times New Roman"/>
-          <w:i/>
-          <w:sz w:val="22"/>
+          <w:sz w:val="24"/>
+        </w:rPr>
+        <w:tab/>
+      </w:r>
+      <w:r>
+        <w:rPr>
+          <w:rFonts w:ascii="Times New Roman" w:hAnsi="Times New Roman" w:cs="Times New Roman"/>
+          <w:sz w:val="24"/>
         </w:rPr>
         <w:t>score(</w:t>
       </w:r>
@@ -2738,15 +2693,14 @@
         <w:rPr>
           <w:rFonts w:ascii="Times New Roman" w:hAnsi="Times New Roman" w:cs="Times New Roman"/>
           <w:i/>
-          <w:sz w:val="22"/>
+          <w:sz w:val="24"/>
         </w:rPr>
         <w:t>q</w:t>
       </w:r>
       <w:r>
         <w:rPr>
           <w:rFonts w:ascii="Times New Roman" w:hAnsi="Times New Roman" w:cs="Times New Roman"/>
-          <w:i/>
-          <w:sz w:val="22"/>
+          <w:sz w:val="24"/>
         </w:rPr>
         <w:t xml:space="preserve">, </w:t>
       </w:r>
@@ -2754,15 +2708,14 @@
         <w:rPr>
           <w:rFonts w:ascii="Times New Roman" w:hAnsi="Times New Roman" w:cs="Times New Roman"/>
           <w:i/>
-          <w:sz w:val="22"/>
+          <w:sz w:val="24"/>
         </w:rPr>
         <w:t>c</w:t>
       </w:r>
       <w:r>
         <w:rPr>
           <w:rFonts w:ascii="Times New Roman" w:hAnsi="Times New Roman" w:cs="Times New Roman"/>
-          <w:i/>
-          <w:sz w:val="22"/>
+          <w:sz w:val="24"/>
         </w:rPr>
         <w:t xml:space="preserve">) = 0.7 · (1 − </w:t>
       </w:r>
@@ -2770,15 +2723,14 @@
         <w:rPr>
           <w:rFonts w:ascii="Times New Roman" w:hAnsi="Times New Roman" w:cs="Times New Roman"/>
           <w:i/>
-          <w:sz w:val="22"/>
+          <w:sz w:val="24"/>
         </w:rPr>
         <w:t>d</w:t>
       </w:r>
       <w:r>
         <w:rPr>
           <w:rFonts w:ascii="Times New Roman" w:hAnsi="Times New Roman" w:cs="Times New Roman"/>
-          <w:i/>
-          <w:sz w:val="22"/>
+          <w:sz w:val="24"/>
           <w:vertAlign w:val="subscript"/>
         </w:rPr>
         <w:t>cos</w:t>
@@ -2786,8 +2738,7 @@
       <w:r>
         <w:rPr>
           <w:rFonts w:ascii="Times New Roman" w:hAnsi="Times New Roman" w:cs="Times New Roman"/>
-          <w:i/>
-          <w:sz w:val="22"/>
+          <w:sz w:val="24"/>
         </w:rPr>
         <w:t>(</w:t>
       </w:r>
@@ -2795,7 +2746,7 @@
         <w:rPr>
           <w:rFonts w:ascii="Times New Roman" w:hAnsi="Times New Roman" w:cs="Times New Roman"/>
           <w:i/>
-          <w:sz w:val="22"/>
+          <w:sz w:val="24"/>
         </w:rPr>
         <w:t>e</w:t>
       </w:r>
@@ -2803,7 +2754,7 @@
         <w:rPr>
           <w:rFonts w:ascii="Times New Roman" w:hAnsi="Times New Roman" w:cs="Times New Roman"/>
           <w:i/>
-          <w:sz w:val="22"/>
+          <w:sz w:val="24"/>
           <w:vertAlign w:val="subscript"/>
         </w:rPr>
         <w:t>q</w:t>
@@ -2811,8 +2762,7 @@
       <w:r>
         <w:rPr>
           <w:rFonts w:ascii="Times New Roman" w:hAnsi="Times New Roman" w:cs="Times New Roman"/>
-          <w:i/>
-          <w:sz w:val="22"/>
+          <w:sz w:val="24"/>
         </w:rPr>
         <w:t xml:space="preserve">, </w:t>
       </w:r>
@@ -2820,7 +2770,7 @@
         <w:rPr>
           <w:rFonts w:ascii="Times New Roman" w:hAnsi="Times New Roman" w:cs="Times New Roman"/>
           <w:i/>
-          <w:sz w:val="22"/>
+          <w:sz w:val="24"/>
         </w:rPr>
         <w:t>e</w:t>
       </w:r>
@@ -2828,7 +2778,7 @@
         <w:rPr>
           <w:rFonts w:ascii="Times New Roman" w:hAnsi="Times New Roman" w:cs="Times New Roman"/>
           <w:i/>
-          <w:sz w:val="22"/>
+          <w:sz w:val="24"/>
           <w:vertAlign w:val="subscript"/>
         </w:rPr>
         <w:t>c</w:t>
@@ -2836,8 +2786,7 @@
       <w:r>
         <w:rPr>
           <w:rFonts w:ascii="Times New Roman" w:hAnsi="Times New Roman" w:cs="Times New Roman"/>
-          <w:i/>
-          <w:sz w:val="22"/>
+          <w:sz w:val="24"/>
         </w:rPr>
         <w:t>)) + 0.3 · ts_rank_cd(</w:t>
       </w:r>
@@ -2845,7 +2794,7 @@
         <w:rPr>
           <w:rFonts w:ascii="Times New Roman" w:hAnsi="Times New Roman" w:cs="Times New Roman"/>
           <w:i/>
-          <w:sz w:val="22"/>
+          <w:sz w:val="24"/>
         </w:rPr>
         <w:t>v</w:t>
       </w:r>
@@ -2853,7 +2802,7 @@
         <w:rPr>
           <w:rFonts w:ascii="Times New Roman" w:hAnsi="Times New Roman" w:cs="Times New Roman"/>
           <w:i/>
-          <w:sz w:val="22"/>
+          <w:sz w:val="24"/>
           <w:vertAlign w:val="subscript"/>
         </w:rPr>
         <w:t>c</w:t>
@@ -2861,8 +2810,7 @@
       <w:r>
         <w:rPr>
           <w:rFonts w:ascii="Times New Roman" w:hAnsi="Times New Roman" w:cs="Times New Roman"/>
-          <w:i/>
-          <w:sz w:val="22"/>
+          <w:sz w:val="24"/>
         </w:rPr>
         <w:t>, tsquery(</w:t>
       </w:r>
@@ -2870,17 +2818,24 @@
         <w:rPr>
           <w:rFonts w:ascii="Times New Roman" w:hAnsi="Times New Roman" w:cs="Times New Roman"/>
           <w:i/>
-          <w:sz w:val="22"/>
+          <w:sz w:val="24"/>
         </w:rPr>
         <w:t>q</w:t>
       </w:r>
       <w:r>
         <w:rPr>
           <w:rFonts w:ascii="Times New Roman" w:hAnsi="Times New Roman" w:cs="Times New Roman"/>
-          <w:i/>
-          <w:sz w:val="22"/>
+          <w:sz w:val="24"/>
         </w:rPr>
-        <w:t>)),</w:t>
+        <w:t>))</w:t>
+      </w:r>
+      <w:r>
+        <w:rPr>
+          <w:rFonts w:ascii="Times New Roman" w:hAnsi="Times New Roman" w:cs="Times New Roman"/>
+          <w:sz w:val="24"/>
+        </w:rPr>
+        <w:tab/>
+        <w:t>(3)</w:t>
       </w:r>
     </w:p>
     <w:p>
@@ -2906,12 +2861,12 @@
           <w:rFonts w:ascii="Times New Roman" w:hAnsi="Times New Roman" w:cs="Times New Roman"/>
           <w:sz w:val="24"/>
         </w:rPr>
-        <w:t xml:space="preserve"> under a New Zealand-specific safety prompt (v2-nz-safety) whose inline citation markers are validated against the passages actually supplied; unmatched markers are stripped before rendering, by construction.</w:t>
+        <w:t xml:space="preserve"> under a New Zealand-specific safety prompt (v2-nz-safety) whose inline citation markers are validated against the supplied passages; unmatched markers are stripped before rendering.</w:t>
       </w:r>
     </w:p>
     <w:p>
       <w:pPr>
-        <w:spacing w:before="200" w:after="80"/>
+        <w:spacing w:before="140" w:after="80"/>
       </w:pPr>
       <w:r>
         <w:rPr>
@@ -2950,7 +2905,7 @@
     </w:p>
     <w:p>
       <w:pPr>
-        <w:spacing w:before="200" w:after="80"/>
+        <w:spacing w:before="140" w:after="80"/>
       </w:pPr>
       <w:r>
         <w:rPr>
@@ -2983,7 +2938,7 @@
           <w:b/>
           <w:sz w:val="20"/>
         </w:rPr>
-        <w:t>Table 3.</w:t>
+        <w:t>Table 3:</w:t>
       </w:r>
       <w:r>
         <w:rPr>
@@ -3001,14 +2956,14 @@
         <w:tblLook w:firstColumn="1" w:firstRow="1" w:lastColumn="0" w:lastRow="0" w:noHBand="0" w:noVBand="1" w:val="04A0"/>
       </w:tblPr>
       <w:tblGrid>
-        <w:gridCol w:w="3009"/>
-        <w:gridCol w:w="3009"/>
-        <w:gridCol w:w="3009"/>
+        <w:gridCol w:w="3118"/>
+        <w:gridCol w:w="3118"/>
+        <w:gridCol w:w="3118"/>
       </w:tblGrid>
       <w:tr>
         <w:tc>
           <w:tcPr>
-            <w:tcW w:type="dxa" w:w="3009"/>
+            <w:tcW w:type="dxa" w:w="3118"/>
           </w:tcPr>
           <w:p>
             <w:r/>
@@ -3024,7 +2979,7 @@
         </w:tc>
         <w:tc>
           <w:tcPr>
-            <w:tcW w:type="dxa" w:w="3009"/>
+            <w:tcW w:type="dxa" w:w="3118"/>
           </w:tcPr>
           <w:p>
             <w:r/>
@@ -3040,7 +2995,7 @@
         </w:tc>
         <w:tc>
           <w:tcPr>
-            <w:tcW w:type="dxa" w:w="3009"/>
+            <w:tcW w:type="dxa" w:w="3118"/>
           </w:tcPr>
           <w:p>
             <w:r/>
@@ -3058,7 +3013,7 @@
       <w:tr>
         <w:tc>
           <w:tcPr>
-            <w:tcW w:type="dxa" w:w="3009"/>
+            <w:tcW w:type="dxa" w:w="3118"/>
           </w:tcPr>
           <w:p>
             <w:r/>
@@ -3073,7 +3028,7 @@
         </w:tc>
         <w:tc>
           <w:tcPr>
-            <w:tcW w:type="dxa" w:w="3009"/>
+            <w:tcW w:type="dxa" w:w="3118"/>
           </w:tcPr>
           <w:p>
             <w:r/>
@@ -3088,7 +3043,7 @@
         </w:tc>
         <w:tc>
           <w:tcPr>
-            <w:tcW w:type="dxa" w:w="3009"/>
+            <w:tcW w:type="dxa" w:w="3118"/>
           </w:tcPr>
           <w:p>
             <w:r/>
@@ -3105,7 +3060,7 @@
       <w:tr>
         <w:tc>
           <w:tcPr>
-            <w:tcW w:type="dxa" w:w="3009"/>
+            <w:tcW w:type="dxa" w:w="3118"/>
           </w:tcPr>
           <w:p>
             <w:r/>
@@ -3120,7 +3075,7 @@
         </w:tc>
         <w:tc>
           <w:tcPr>
-            <w:tcW w:type="dxa" w:w="3009"/>
+            <w:tcW w:type="dxa" w:w="3118"/>
           </w:tcPr>
           <w:p>
             <w:r/>
@@ -3135,7 +3090,7 @@
         </w:tc>
         <w:tc>
           <w:tcPr>
-            <w:tcW w:type="dxa" w:w="3009"/>
+            <w:tcW w:type="dxa" w:w="3118"/>
           </w:tcPr>
           <w:p>
             <w:r/>
@@ -3152,7 +3107,7 @@
       <w:tr>
         <w:tc>
           <w:tcPr>
-            <w:tcW w:type="dxa" w:w="3009"/>
+            <w:tcW w:type="dxa" w:w="3118"/>
           </w:tcPr>
           <w:p>
             <w:r/>
@@ -3167,7 +3122,7 @@
         </w:tc>
         <w:tc>
           <w:tcPr>
-            <w:tcW w:type="dxa" w:w="3009"/>
+            <w:tcW w:type="dxa" w:w="3118"/>
           </w:tcPr>
           <w:p>
             <w:r/>
@@ -3182,7 +3137,7 @@
         </w:tc>
         <w:tc>
           <w:tcPr>
-            <w:tcW w:type="dxa" w:w="3009"/>
+            <w:tcW w:type="dxa" w:w="3118"/>
           </w:tcPr>
           <w:p>
             <w:r/>
@@ -3199,7 +3154,7 @@
       <w:tr>
         <w:tc>
           <w:tcPr>
-            <w:tcW w:type="dxa" w:w="3009"/>
+            <w:tcW w:type="dxa" w:w="3118"/>
           </w:tcPr>
           <w:p>
             <w:r/>
@@ -3214,7 +3169,7 @@
         </w:tc>
         <w:tc>
           <w:tcPr>
-            <w:tcW w:type="dxa" w:w="3009"/>
+            <w:tcW w:type="dxa" w:w="3118"/>
           </w:tcPr>
           <w:p>
             <w:r/>
@@ -3229,7 +3184,7 @@
         </w:tc>
         <w:tc>
           <w:tcPr>
-            <w:tcW w:type="dxa" w:w="3009"/>
+            <w:tcW w:type="dxa" w:w="3118"/>
           </w:tcPr>
           <w:p>
             <w:r/>
@@ -3246,7 +3201,7 @@
       <w:tr>
         <w:tc>
           <w:tcPr>
-            <w:tcW w:type="dxa" w:w="3009"/>
+            <w:tcW w:type="dxa" w:w="3118"/>
           </w:tcPr>
           <w:p>
             <w:r/>
@@ -3261,7 +3216,7 @@
         </w:tc>
         <w:tc>
           <w:tcPr>
-            <w:tcW w:type="dxa" w:w="3009"/>
+            <w:tcW w:type="dxa" w:w="3118"/>
           </w:tcPr>
           <w:p>
             <w:r/>
@@ -3276,7 +3231,7 @@
         </w:tc>
         <w:tc>
           <w:tcPr>
-            <w:tcW w:type="dxa" w:w="3009"/>
+            <w:tcW w:type="dxa" w:w="3118"/>
           </w:tcPr>
           <w:p>
             <w:r/>
@@ -3293,7 +3248,7 @@
       <w:tr>
         <w:tc>
           <w:tcPr>
-            <w:tcW w:type="dxa" w:w="3009"/>
+            <w:tcW w:type="dxa" w:w="3118"/>
           </w:tcPr>
           <w:p>
             <w:r/>
@@ -3308,7 +3263,7 @@
         </w:tc>
         <w:tc>
           <w:tcPr>
-            <w:tcW w:type="dxa" w:w="3009"/>
+            <w:tcW w:type="dxa" w:w="3118"/>
           </w:tcPr>
           <w:p>
             <w:r/>
@@ -3323,7 +3278,7 @@
         </w:tc>
         <w:tc>
           <w:tcPr>
-            <w:tcW w:type="dxa" w:w="3009"/>
+            <w:tcW w:type="dxa" w:w="3118"/>
           </w:tcPr>
           <w:p>
             <w:r/>
@@ -3340,7 +3295,7 @@
       <w:tr>
         <w:tc>
           <w:tcPr>
-            <w:tcW w:type="dxa" w:w="3009"/>
+            <w:tcW w:type="dxa" w:w="3118"/>
           </w:tcPr>
           <w:p>
             <w:r/>
@@ -3355,7 +3310,7 @@
         </w:tc>
         <w:tc>
           <w:tcPr>
-            <w:tcW w:type="dxa" w:w="3009"/>
+            <w:tcW w:type="dxa" w:w="3118"/>
           </w:tcPr>
           <w:p>
             <w:r/>
@@ -3370,7 +3325,7 @@
         </w:tc>
         <w:tc>
           <w:tcPr>
-            <w:tcW w:type="dxa" w:w="3009"/>
+            <w:tcW w:type="dxa" w:w="3118"/>
           </w:tcPr>
           <w:p>
             <w:r/>
@@ -3387,7 +3342,7 @@
       <w:tr>
         <w:tc>
           <w:tcPr>
-            <w:tcW w:type="dxa" w:w="3009"/>
+            <w:tcW w:type="dxa" w:w="3118"/>
           </w:tcPr>
           <w:p>
             <w:r/>
@@ -3402,7 +3357,7 @@
         </w:tc>
         <w:tc>
           <w:tcPr>
-            <w:tcW w:type="dxa" w:w="3009"/>
+            <w:tcW w:type="dxa" w:w="3118"/>
           </w:tcPr>
           <w:p>
             <w:r/>
@@ -3417,7 +3372,7 @@
         </w:tc>
         <w:tc>
           <w:tcPr>
-            <w:tcW w:type="dxa" w:w="3009"/>
+            <w:tcW w:type="dxa" w:w="3118"/>
           </w:tcPr>
           <w:p>
             <w:r/>
@@ -3434,7 +3389,7 @@
       <w:tr>
         <w:tc>
           <w:tcPr>
-            <w:tcW w:type="dxa" w:w="3009"/>
+            <w:tcW w:type="dxa" w:w="3118"/>
           </w:tcPr>
           <w:p>
             <w:r/>
@@ -3449,7 +3404,7 @@
         </w:tc>
         <w:tc>
           <w:tcPr>
-            <w:tcW w:type="dxa" w:w="3009"/>
+            <w:tcW w:type="dxa" w:w="3118"/>
           </w:tcPr>
           <w:p>
             <w:r/>
@@ -3464,7 +3419,7 @@
         </w:tc>
         <w:tc>
           <w:tcPr>
-            <w:tcW w:type="dxa" w:w="3009"/>
+            <w:tcW w:type="dxa" w:w="3118"/>
           </w:tcPr>
           <w:p>
             <w:r/>
@@ -3481,7 +3436,7 @@
       <w:tr>
         <w:tc>
           <w:tcPr>
-            <w:tcW w:type="dxa" w:w="3009"/>
+            <w:tcW w:type="dxa" w:w="3118"/>
           </w:tcPr>
           <w:p>
             <w:r/>
@@ -3496,7 +3451,7 @@
         </w:tc>
         <w:tc>
           <w:tcPr>
-            <w:tcW w:type="dxa" w:w="3009"/>
+            <w:tcW w:type="dxa" w:w="3118"/>
           </w:tcPr>
           <w:p>
             <w:r/>
@@ -3511,7 +3466,7 @@
         </w:tc>
         <w:tc>
           <w:tcPr>
-            <w:tcW w:type="dxa" w:w="3009"/>
+            <w:tcW w:type="dxa" w:w="3118"/>
           </w:tcPr>
           <w:p>
             <w:r/>
@@ -3548,7 +3503,7 @@
           <w:rFonts w:ascii="Times New Roman" w:hAnsi="Times New Roman" w:cs="Times New Roman"/>
           <w:sz w:val="24"/>
         </w:rPr>
-        <w:t xml:space="preserve"> An earlier evaluation on the pre-overhaul corpus found 29 of 32 in-scope questions retrieving their expected chunk; the misses were a corpus-imbalance artefact in which bulk iSupport chunks outranked hand-authored targets (two at ranks 6 and 7, one beyond rank 50). The source-family cap recovered the two competitive targets, raising retrieval to 31 of 32, where it has remained through every subsequent change: the prompt and citation refactors reproduced the frozen baseline ranking exactly, and re-ingesting the corpus (449 to 551 chunks) left recall@5 at 0.969 at each step. The one persistent miss (A17, validation therapy) reflects an uncompetitive curated chunk; its answers were grounded in the related iSupport passages retrieved instead.</w:t>
+        <w:t xml:space="preserve"> On the pre-overhaul corpus, 29 of 32 in-scope questions retrieved their expected chunk; the misses were a corpus-imbalance artefact — bulk iSupport chunks outranked hand-authored targets (two at ranks 6 and 7, one beyond rank 50). The source-family cap recovered the two competitive targets, raising retrieval to 31 of 32, where it has remained through every subsequent change: the prompt and citation refactors reproduced the frozen baseline ranking exactly, and re-ingesting the corpus (449 to 551 chunks) left recall@5 at 0.969 at each step. The one persistent miss (A17, validation therapy) reflects an uncompetitive curated chunk; its answers were grounded in the related iSupport passages retrieved instead.</w:t>
       </w:r>
     </w:p>
     <w:p>
@@ -3608,12 +3563,13 @@
           <w:rFonts w:ascii="Times New Roman" w:hAnsi="Times New Roman" w:cs="Times New Roman"/>
           <w:sz w:val="24"/>
         </w:rPr>
-        <w:t xml:space="preserve"> Across all 15 grid cells, recall@5 was constant at 0.969, and the similarity threshold was inert from 0.15 to 0.30. Tightening the family cap to one improved recall@3 by 0.031 and MRR by 0.013, but because every labelled-relevant chunk is curated, a tighter cap on the competing family mechanically flatters the metric; the configuration was left unchanged pending relabelling on the new corpus.</w:t>
+        <w:t xml:space="preserve"> Across all 15 grid cells, recall@5 was constant at 0.969, and the similarity threshold was inert from 0.15 to 0.30. Tightening the family cap to one improved recall@3 by 0.031 and MRR by 0.013, but every labelled-relevant chunk is curated, so a tighter cap on the competing family mechanically flatters the metric; the configuration was left unchanged.</w:t>
       </w:r>
     </w:p>
     <w:p>
       <w:pPr>
-        <w:spacing w:before="200" w:after="80"/>
+        <w:spacing w:before="140" w:after="80"/>
+        <w:jc w:val="center"/>
       </w:pPr>
       <w:r>
         <w:rPr>
@@ -3686,7 +3642,7 @@
           <w:b/>
           <w:sz w:val="20"/>
         </w:rPr>
-        <w:t>Table 4.</w:t>
+        <w:t>Table 4:</w:t>
       </w:r>
       <w:r>
         <w:rPr>
@@ -3704,17 +3660,17 @@
         <w:tblLook w:firstColumn="1" w:firstRow="1" w:lastColumn="0" w:lastRow="0" w:noHBand="0" w:noVBand="1" w:val="04A0"/>
       </w:tblPr>
       <w:tblGrid>
-        <w:gridCol w:w="1504"/>
-        <w:gridCol w:w="1504"/>
-        <w:gridCol w:w="1504"/>
-        <w:gridCol w:w="1504"/>
-        <w:gridCol w:w="1504"/>
-        <w:gridCol w:w="1504"/>
+        <w:gridCol w:w="1559"/>
+        <w:gridCol w:w="1559"/>
+        <w:gridCol w:w="1559"/>
+        <w:gridCol w:w="1559"/>
+        <w:gridCol w:w="1559"/>
+        <w:gridCol w:w="1559"/>
       </w:tblGrid>
       <w:tr>
         <w:tc>
           <w:tcPr>
-            <w:tcW w:type="dxa" w:w="1504"/>
+            <w:tcW w:type="dxa" w:w="1559"/>
           </w:tcPr>
           <w:p>
             <w:r/>
@@ -3730,7 +3686,7 @@
         </w:tc>
         <w:tc>
           <w:tcPr>
-            <w:tcW w:type="dxa" w:w="1504"/>
+            <w:tcW w:type="dxa" w:w="1559"/>
           </w:tcPr>
           <w:p>
             <w:r/>
@@ -3746,7 +3702,7 @@
         </w:tc>
         <w:tc>
           <w:tcPr>
-            <w:tcW w:type="dxa" w:w="1504"/>
+            <w:tcW w:type="dxa" w:w="1559"/>
           </w:tcPr>
           <w:p>
             <w:r/>
@@ -3762,7 +3718,7 @@
         </w:tc>
         <w:tc>
           <w:tcPr>
-            <w:tcW w:type="dxa" w:w="1504"/>
+            <w:tcW w:type="dxa" w:w="1559"/>
           </w:tcPr>
           <w:p>
             <w:r/>
@@ -3778,7 +3734,7 @@
         </w:tc>
         <w:tc>
           <w:tcPr>
-            <w:tcW w:type="dxa" w:w="1504"/>
+            <w:tcW w:type="dxa" w:w="1559"/>
           </w:tcPr>
           <w:p>
             <w:r/>
@@ -3794,7 +3750,7 @@
         </w:tc>
         <w:tc>
           <w:tcPr>
-            <w:tcW w:type="dxa" w:w="1504"/>
+            <w:tcW w:type="dxa" w:w="1559"/>
           </w:tcPr>
           <w:p>
             <w:r/>
@@ -3812,7 +3768,7 @@
       <w:tr>
         <w:tc>
           <w:tcPr>
-            <w:tcW w:type="dxa" w:w="1504"/>
+            <w:tcW w:type="dxa" w:w="1559"/>
           </w:tcPr>
           <w:p>
             <w:r/>
@@ -3827,7 +3783,7 @@
         </w:tc>
         <w:tc>
           <w:tcPr>
-            <w:tcW w:type="dxa" w:w="1504"/>
+            <w:tcW w:type="dxa" w:w="1559"/>
           </w:tcPr>
           <w:p>
             <w:r/>
@@ -3842,7 +3798,7 @@
         </w:tc>
         <w:tc>
           <w:tcPr>
-            <w:tcW w:type="dxa" w:w="1504"/>
+            <w:tcW w:type="dxa" w:w="1559"/>
           </w:tcPr>
           <w:p>
             <w:r/>
@@ -3857,7 +3813,7 @@
         </w:tc>
         <w:tc>
           <w:tcPr>
-            <w:tcW w:type="dxa" w:w="1504"/>
+            <w:tcW w:type="dxa" w:w="1559"/>
           </w:tcPr>
           <w:p>
             <w:r/>
@@ -3872,7 +3828,7 @@
         </w:tc>
         <w:tc>
           <w:tcPr>
-            <w:tcW w:type="dxa" w:w="1504"/>
+            <w:tcW w:type="dxa" w:w="1559"/>
           </w:tcPr>
           <w:p>
             <w:r/>
@@ -3887,7 +3843,7 @@
         </w:tc>
         <w:tc>
           <w:tcPr>
-            <w:tcW w:type="dxa" w:w="1504"/>
+            <w:tcW w:type="dxa" w:w="1559"/>
           </w:tcPr>
           <w:p>
             <w:r/>
@@ -3904,7 +3860,7 @@
       <w:tr>
         <w:tc>
           <w:tcPr>
-            <w:tcW w:type="dxa" w:w="1504"/>
+            <w:tcW w:type="dxa" w:w="1559"/>
           </w:tcPr>
           <w:p>
             <w:r/>
@@ -3919,7 +3875,7 @@
         </w:tc>
         <w:tc>
           <w:tcPr>
-            <w:tcW w:type="dxa" w:w="1504"/>
+            <w:tcW w:type="dxa" w:w="1559"/>
           </w:tcPr>
           <w:p>
             <w:r/>
@@ -3934,7 +3890,7 @@
         </w:tc>
         <w:tc>
           <w:tcPr>
-            <w:tcW w:type="dxa" w:w="1504"/>
+            <w:tcW w:type="dxa" w:w="1559"/>
           </w:tcPr>
           <w:p>
             <w:r/>
@@ -3949,7 +3905,7 @@
         </w:tc>
         <w:tc>
           <w:tcPr>
-            <w:tcW w:type="dxa" w:w="1504"/>
+            <w:tcW w:type="dxa" w:w="1559"/>
           </w:tcPr>
           <w:p>
             <w:r/>
@@ -3964,7 +3920,7 @@
         </w:tc>
         <w:tc>
           <w:tcPr>
-            <w:tcW w:type="dxa" w:w="1504"/>
+            <w:tcW w:type="dxa" w:w="1559"/>
           </w:tcPr>
           <w:p>
             <w:r/>
@@ -3979,7 +3935,7 @@
         </w:tc>
         <w:tc>
           <w:tcPr>
-            <w:tcW w:type="dxa" w:w="1504"/>
+            <w:tcW w:type="dxa" w:w="1559"/>
           </w:tcPr>
           <w:p>
             <w:r/>
@@ -3996,7 +3952,7 @@
       <w:tr>
         <w:tc>
           <w:tcPr>
-            <w:tcW w:type="dxa" w:w="1504"/>
+            <w:tcW w:type="dxa" w:w="1559"/>
           </w:tcPr>
           <w:p>
             <w:r/>
@@ -4011,7 +3967,7 @@
         </w:tc>
         <w:tc>
           <w:tcPr>
-            <w:tcW w:type="dxa" w:w="1504"/>
+            <w:tcW w:type="dxa" w:w="1559"/>
           </w:tcPr>
           <w:p>
             <w:r/>
@@ -4026,7 +3982,7 @@
         </w:tc>
         <w:tc>
           <w:tcPr>
-            <w:tcW w:type="dxa" w:w="1504"/>
+            <w:tcW w:type="dxa" w:w="1559"/>
           </w:tcPr>
           <w:p>
             <w:r/>
@@ -4041,7 +3997,7 @@
         </w:tc>
         <w:tc>
           <w:tcPr>
-            <w:tcW w:type="dxa" w:w="1504"/>
+            <w:tcW w:type="dxa" w:w="1559"/>
           </w:tcPr>
           <w:p>
             <w:r/>
@@ -4056,7 +4012,7 @@
         </w:tc>
         <w:tc>
           <w:tcPr>
-            <w:tcW w:type="dxa" w:w="1504"/>
+            <w:tcW w:type="dxa" w:w="1559"/>
           </w:tcPr>
           <w:p>
             <w:r/>
@@ -4071,7 +4027,7 @@
         </w:tc>
         <w:tc>
           <w:tcPr>
-            <w:tcW w:type="dxa" w:w="1504"/>
+            <w:tcW w:type="dxa" w:w="1559"/>
           </w:tcPr>
           <w:p>
             <w:r/>
@@ -4088,7 +4044,7 @@
       <w:tr>
         <w:tc>
           <w:tcPr>
-            <w:tcW w:type="dxa" w:w="1504"/>
+            <w:tcW w:type="dxa" w:w="1559"/>
           </w:tcPr>
           <w:p>
             <w:r/>
@@ -4103,7 +4059,7 @@
         </w:tc>
         <w:tc>
           <w:tcPr>
-            <w:tcW w:type="dxa" w:w="1504"/>
+            <w:tcW w:type="dxa" w:w="1559"/>
           </w:tcPr>
           <w:p>
             <w:r/>
@@ -4118,7 +4074,7 @@
         </w:tc>
         <w:tc>
           <w:tcPr>
-            <w:tcW w:type="dxa" w:w="1504"/>
+            <w:tcW w:type="dxa" w:w="1559"/>
           </w:tcPr>
           <w:p>
             <w:r/>
@@ -4133,7 +4089,7 @@
         </w:tc>
         <w:tc>
           <w:tcPr>
-            <w:tcW w:type="dxa" w:w="1504"/>
+            <w:tcW w:type="dxa" w:w="1559"/>
           </w:tcPr>
           <w:p>
             <w:r/>
@@ -4148,7 +4104,7 @@
         </w:tc>
         <w:tc>
           <w:tcPr>
-            <w:tcW w:type="dxa" w:w="1504"/>
+            <w:tcW w:type="dxa" w:w="1559"/>
           </w:tcPr>
           <w:p>
             <w:r/>
@@ -4163,7 +4119,7 @@
         </w:tc>
         <w:tc>
           <w:tcPr>
-            <w:tcW w:type="dxa" w:w="1504"/>
+            <w:tcW w:type="dxa" w:w="1559"/>
           </w:tcPr>
           <w:p>
             <w:r/>
@@ -4197,7 +4153,8 @@
     </w:p>
     <w:p>
       <w:pPr>
-        <w:spacing w:before="200" w:after="80"/>
+        <w:spacing w:before="140" w:after="80"/>
+        <w:jc w:val="center"/>
       </w:pPr>
       <w:r>
         <w:rPr>
@@ -4225,7 +4182,7 @@
           <w:rFonts w:ascii="Times New Roman" w:hAnsi="Times New Roman" w:cs="Times New Roman"/>
           <w:sz w:val="24"/>
         </w:rPr>
-        <w:t xml:space="preserve"> Caregivers complete representative resource-finding tasks with the avatar interface versus a text-only baseline, measuring task success, time on task, and a standard usability instrument (UAHPEC ethics approval required; protocol drafted). The component results above validate enabling technology only — the project's accessibility, personalisation, and usability questions can only be answered by this study.</w:t>
+        <w:t xml:space="preserve"> Caregivers complete representative resource-finding tasks with the avatar interface versus a text-only baseline, measuring task success, time on task, and a standard usability instrument (UAHPEC ethics approval required; protocol drafted). The results above validate enabling technology only; the accessibility, personalisation, and usability questions can only be answered by this study.</w:t>
       </w:r>
     </w:p>
     <w:p>
@@ -4329,13 +4286,27 @@
       </w:r>
     </w:p>
     <w:sectPr>
+      <w:footerReference w:type="default" r:id="rId9"/>
       <w:pgSz w:w="11906" w:h="16838"/>
-      <w:pgMar w:top="1440" w:right="1440" w:bottom="1440" w:left="1440" w:header="720" w:footer="720" w:gutter="0"/>
+      <w:pgMar w:top="1417" w:right="1417" w:bottom="2041" w:left="1134" w:header="720" w:footer="720" w:gutter="0"/>
       <w:cols w:space="720"/>
+      <w:titlePg/>
       <w:docGrid w:linePitch="360"/>
     </w:sectPr>
   </w:body>
 </w:document>
+</file>
+
+<file path=word/footer1.xml><?xml version="1.0" encoding="utf-8"?>
+<w:ftr xmlns:m="http://schemas.openxmlformats.org/officeDocument/2006/math" xmlns:mc="http://schemas.openxmlformats.org/markup-compatibility/2006" xmlns:mo="http://schemas.microsoft.com/office/mac/office/2008/main" xmlns:mv="urn:schemas-microsoft-com:mac:vml" xmlns:o="urn:schemas-microsoft-com:office:office" xmlns:r="http://schemas.openxmlformats.org/officeDocument/2006/relationships" xmlns:v="urn:schemas-microsoft-com:vml" xmlns:w10="urn:schemas-microsoft-com:office:word" xmlns:w14="http://schemas.microsoft.com/office/word/2010/wordml" xmlns:w="http://schemas.openxmlformats.org/wordprocessingml/2006/main" xmlns:wne="http://schemas.microsoft.com/office/word/2006/wordml" xmlns:wp14="http://schemas.microsoft.com/office/word/2010/wordprocessingDrawing" xmlns:wp="http://schemas.openxmlformats.org/drawingml/2006/wordprocessingDrawing" xmlns:wpc="http://schemas.microsoft.com/office/word/2010/wordprocessingCanvas" xmlns:wpg="http://schemas.microsoft.com/office/word/2010/wordprocessingGroup" xmlns:wpi="http://schemas.microsoft.com/office/word/2010/wordprocessingInk" xmlns:wps="http://schemas.microsoft.com/office/word/2010/wordprocessingShape" mc:Ignorable="w14 wp14">
+  <w:p>
+    <w:pPr>
+      <w:pStyle w:val="Footer"/>
+      <w:jc w:val="right"/>
+    </w:pPr>
+    <w:fldSimple w:instr="PAGE"/>
+  </w:p>
+</w:ftr>
 </file>
 
 <file path=word/numbering.xml><?xml version="1.0" encoding="utf-8"?>

</xml_diff>

<commit_message>
docs(report): restore Fig.1 bar chart — fit via layout, not content cuts
The 7-page overflow was a page-break cascade, not volume: figures that can't
fit at a page bottom jump whole to the next page. Fixed by sizing figures to
4.4in and collapsing the post-table spacer line to 4pt (paragraph-mark font).
Both figures restored; no content dropped. Word-verified 6 pages; PDF
re-exported.

Co-Authored-By: Claude Fable 5 <noreply@anthropic.com>
</commit_message>
<xml_diff>
--- a/docs/report/DementiaGuide_MidYear_Technical_Report.docx
+++ b/docs/report/DementiaGuide_MidYear_Technical_Report.docx
@@ -1428,7 +1428,7 @@
           <w:rFonts w:ascii="Times New Roman" w:hAnsi="Times New Roman" w:cs="Times New Roman"/>
           <w:sz w:val="24"/>
         </w:rPr>
-        <w:t xml:space="preserve"> fixture passed all 10 of its checks, giving 95 of 95 (Table 1). Every fixture improved; the largest gain was </w:t>
+        <w:t xml:space="preserve"> fixture passed all 10 of its checks, giving 95 of 95 (Table 1, Fig. 1). Every fixture improved; the largest gain was </w:t>
       </w:r>
       <w:r>
         <w:rPr>
@@ -1970,8 +1970,70 @@
     </w:tbl>
     <w:p>
       <w:pPr>
-        <w:spacing w:after="40"/>
+        <w:spacing w:after="40" w:line="240" w:lineRule="auto"/>
+        <w:rPr>
+          <w:sz w:val="8"/>
+        </w:rPr>
       </w:pPr>
+    </w:p>
+    <w:p>
+      <w:pPr>
+        <w:jc w:val="center"/>
+      </w:pPr>
+      <w:r>
+        <w:drawing>
+          <wp:inline xmlns:a="http://schemas.openxmlformats.org/drawingml/2006/main" xmlns:pic="http://schemas.openxmlformats.org/drawingml/2006/picture">
+            <wp:extent cx="4023360" cy="1918833"/>
+            <wp:docPr id="1" name="Picture 1"/>
+            <wp:cNvGraphicFramePr>
+              <a:graphicFrameLocks noChangeAspect="1"/>
+            </wp:cNvGraphicFramePr>
+            <a:graphic>
+              <a:graphicData uri="http://schemas.openxmlformats.org/drawingml/2006/picture">
+                <pic:pic>
+                  <pic:nvPicPr>
+                    <pic:cNvPr id="0" name="fig1_checks_passed.png"/>
+                    <pic:cNvPicPr/>
+                  </pic:nvPicPr>
+                  <pic:blipFill>
+                    <a:blip r:embed="rId10"/>
+                    <a:stretch>
+                      <a:fillRect/>
+                    </a:stretch>
+                  </pic:blipFill>
+                  <pic:spPr>
+                    <a:xfrm>
+                      <a:off x="0" y="0"/>
+                      <a:ext cx="4023360" cy="1918833"/>
+                    </a:xfrm>
+                    <a:prstGeom prst="rect"/>
+                  </pic:spPr>
+                </pic:pic>
+              </a:graphicData>
+            </a:graphic>
+          </wp:inline>
+        </w:drawing>
+      </w:r>
+    </w:p>
+    <w:p>
+      <w:pPr>
+        <w:jc w:val="center"/>
+      </w:pPr>
+      <w:r>
+        <w:rPr>
+          <w:rFonts w:ascii="Times New Roman" w:hAnsi="Times New Roman" w:cs="Times New Roman"/>
+          <w:b/>
+          <w:sz w:val="20"/>
+        </w:rPr>
+        <w:t>Fig. 1.</w:t>
+      </w:r>
+      <w:r>
+        <w:rPr>
+          <w:rFonts w:ascii="Times New Roman" w:hAnsi="Times New Roman" w:cs="Times New Roman"/>
+          <w:sz w:val="20"/>
+        </w:rPr>
+        <w:t xml:space="preserve"> Acceptance checks passed per fixture on the baseline and final pipelines. The light backdrop bar is the total number of checks in each fixture.</w:t>
+      </w:r>
     </w:p>
     <w:p>
       <w:pPr>
@@ -1996,7 +2058,7 @@
           <w:rFonts w:ascii="Times New Roman" w:hAnsi="Times New Roman" w:cs="Times New Roman"/>
           <w:sz w:val="24"/>
         </w:rPr>
-        <w:t xml:space="preserve"> peaks rose from a baseline range of 0.58 to 0.94 to a consistent 0.93 to 0.95, while open-shape leakage during closures fell to at most 0.08 — the combined effect of the guaranteed-contact maximum and the suppression pass. Labiodental peaks rose from a minimum of 0.525 to at least 0.94. All 27 baseline tongue checks measured exactly 0.00; on the final pipeline all passed with peaks of 0.40 to 0.72. Pause leakage fell from up to 0.54 to at most 0.10, and end-of-utterance decay fell from 313 to 324 ms down to 30 to 95 ms. Fig. 1 shows three of the resulting viseme shapes with their measured weights.</w:t>
+        <w:t xml:space="preserve"> peaks rose from a baseline range of 0.58 to 0.94 to a consistent 0.93 to 0.95, while open-shape leakage during closures fell to at most 0.08 — the combined effect of the guaranteed-contact maximum and the suppression pass. Labiodental peaks rose from a minimum of 0.525 to at least 0.94. All 27 baseline tongue checks measured exactly 0.00; on the final pipeline all passed with peaks of 0.40 to 0.72. Pause leakage fell from up to 0.54 to at most 0.10, and end-of-utterance decay fell from 313 to 324 ms down to 30 to 95 ms. Fig. 2 shows three of the resulting viseme shapes with their measured weights.</w:t>
       </w:r>
     </w:p>
     <w:p>
@@ -2467,7 +2529,10 @@
     </w:tbl>
     <w:p>
       <w:pPr>
-        <w:spacing w:after="40"/>
+        <w:spacing w:after="40" w:line="240" w:lineRule="auto"/>
+        <w:rPr>
+          <w:sz w:val="8"/>
+        </w:rPr>
       </w:pPr>
     </w:p>
     <w:p>
@@ -2477,8 +2542,8 @@
       <w:r>
         <w:drawing>
           <wp:inline xmlns:a="http://schemas.openxmlformats.org/drawingml/2006/main" xmlns:pic="http://schemas.openxmlformats.org/drawingml/2006/picture">
-            <wp:extent cx="4480560" cy="1959389"/>
-            <wp:docPr id="1" name="Picture 1"/>
+            <wp:extent cx="4023360" cy="1759451"/>
+            <wp:docPr id="2" name="Picture 2"/>
             <wp:cNvGraphicFramePr>
               <a:graphicFrameLocks noChangeAspect="1"/>
             </wp:cNvGraphicFramePr>
@@ -2490,7 +2555,7 @@
                     <pic:cNvPicPr/>
                   </pic:nvPicPr>
                   <pic:blipFill>
-                    <a:blip r:embed="rId10"/>
+                    <a:blip r:embed="rId11"/>
                     <a:stretch>
                       <a:fillRect/>
                     </a:stretch>
@@ -2498,7 +2563,7 @@
                   <pic:spPr>
                     <a:xfrm>
                       <a:off x="0" y="0"/>
-                      <a:ext cx="4480560" cy="1959389"/>
+                      <a:ext cx="4023360" cy="1759451"/>
                     </a:xfrm>
                     <a:prstGeom prst="rect"/>
                   </pic:spPr>
@@ -2519,14 +2584,14 @@
           <w:b/>
           <w:sz w:val="20"/>
         </w:rPr>
-        <w:t>Fig. 1.</w:t>
+        <w:t>Fig. 2.</w:t>
       </w:r>
       <w:r>
         <w:rPr>
           <w:rFonts w:ascii="Times New Roman" w:hAnsi="Times New Roman" w:cs="Times New Roman"/>
           <w:sz w:val="20"/>
         </w:rPr>
-        <w:t xml:space="preserve"> Viseme shapes produced by the final pipeline (Unity Editor capture): a bilabial closure with sealed lips, an open vowel, and a labiodental lip-to-teeth contact, each annotated with the measured blendshape weight. A like-for-like baseline capture is unavailable (the character was revised in the same change set); the quantitative comparison is carried by Tables 1 and 2.</w:t>
+        <w:t xml:space="preserve"> Viseme shapes produced by the final pipeline (Unity Editor capture): a bilabial closure with sealed lips, an open vowel, and a labiodental lip-to-teeth contact, each annotated with the measured blendshape weight. A like-for-like baseline capture is unavailable (the character was revised in the same change set); the quantitative comparison is carried by Fig. 1 and Table 2.</w:t>
       </w:r>
     </w:p>
     <w:p>
@@ -3483,7 +3548,10 @@
     </w:tbl>
     <w:p>
       <w:pPr>
-        <w:spacing w:after="40"/>
+        <w:spacing w:after="40" w:line="240" w:lineRule="auto"/>
+        <w:rPr>
+          <w:sz w:val="8"/>
+        </w:rPr>
       </w:pPr>
     </w:p>
     <w:p>
@@ -4136,7 +4204,10 @@
     </w:tbl>
     <w:p>
       <w:pPr>
-        <w:spacing w:after="40"/>
+        <w:spacing w:after="40" w:line="240" w:lineRule="auto"/>
+        <w:rPr>
+          <w:sz w:val="8"/>
+        </w:rPr>
       </w:pPr>
     </w:p>
     <w:p>

</xml_diff>

<commit_message>
docs(report): final content-check corrections
Verified every number against raw sources once more. Fixes from the pass:
region failures were 2 answers (S10, N2 in safety_619f8f9_v1.csv), not 3 —
the 3 counted assertion instances; enumeration now sums 4+2+2=8 matching the
8 failed checks. 'assertions' -> 'checks' terminology (36 checks, each gated
by multiple assertions). Defined the two previously-undefined symbols
(suppression strength kappa, cosine distance d_cos). Word-verified 6 pages;
PDF re-exported.

Co-Authored-By: Claude Fable 5 <noreply@anthropic.com>
</commit_message>
<xml_diff>
--- a/docs/report/DementiaGuide_MidYear_Technical_Report.docx
+++ b/docs/report/DementiaGuide_MidYear_Technical_Report.docx
@@ -1336,7 +1336,7 @@
           <w:rFonts w:ascii="Times New Roman" w:hAnsi="Times New Roman" w:cs="Times New Roman"/>
           <w:sz w:val="24"/>
         </w:rPr>
-        <w:t>)) while a closure is dominant, guaranteeing that the lips visibly meet. Curves are baked once per utterance; playback is a constant-time frame lookup. Upstream, a grapheme-to-phoneme (G2P) pipeline replaced per-character heuristics: text is normalised (numbers, currency, abbreviations), converted to ARPAbet phonemes through a lexicon with letter-to-sound rules, and mapped to the avatar's 14 visemes with per-phoneme timing.</w:t>
+        <w:t>)), with suppression strength κ, while a closure is dominant, guaranteeing that the lips visibly meet. Curves are baked once per utterance; playback is a constant-time frame lookup. Upstream, a grapheme-to-phoneme (G2P) pipeline replaced per-character heuristics: text is normalised (numbers, currency, abbreviations), converted to ARPAbet phonemes through a lexicon with letter-to-sound rules, and mapped to the avatar's 14 visemes with per-phoneme timing.</w:t>
       </w:r>
     </w:p>
     <w:p>
@@ -2729,7 +2729,30 @@
           <w:rFonts w:ascii="Times New Roman" w:hAnsi="Times New Roman" w:cs="Times New Roman"/>
           <w:sz w:val="24"/>
         </w:rPr>
-        <w:t xml:space="preserve"> (title, content, and tags), the score is a weighted sum, not reciprocal-rank fusion:</w:t>
+        <w:t xml:space="preserve"> (title, content, and tags), the score is a weighted sum of the cosine similarity (1 − </w:t>
+      </w:r>
+      <w:r>
+        <w:rPr>
+          <w:rFonts w:ascii="Times New Roman" w:hAnsi="Times New Roman" w:cs="Times New Roman"/>
+          <w:i/>
+          <w:sz w:val="24"/>
+        </w:rPr>
+        <w:t>d</w:t>
+      </w:r>
+      <w:r>
+        <w:rPr>
+          <w:rFonts w:ascii="Times New Roman" w:hAnsi="Times New Roman" w:cs="Times New Roman"/>
+          <w:sz w:val="24"/>
+          <w:vertAlign w:val="subscript"/>
+        </w:rPr>
+        <w:t>cos</w:t>
+      </w:r>
+      <w:r>
+        <w:rPr>
+          <w:rFonts w:ascii="Times New Roman" w:hAnsi="Times New Roman" w:cs="Times New Roman"/>
+          <w:sz w:val="24"/>
+        </w:rPr>
+        <w:t>) and the PostgreSQL cover-density lexical rank, not reciprocal-rank fusion:</w:t>
       </w:r>
     </w:p>
     <w:p>
@@ -2951,7 +2974,7 @@
           <w:rFonts w:ascii="Times New Roman" w:hAnsi="Times New Roman" w:cs="Times New Roman"/>
           <w:sz w:val="24"/>
         </w:rPr>
-        <w:t>A 42-question caregiver set was used: 32 in-scope questions (29 direct, each labelled with an expected chunk, plus three near-neighbour phrasings), four boundary questions probing unsafe specifics (drug dosing, cure claims, facility recommendations, prognosis), and six out-of-scope questions. Retrieval was scored deterministically (expected chunk within the top five) against the live database; safety by 36 deterministic MUST/MUST-NOT regular-expression assertions over generations at temperature 0 with a fixed seed, covering emergency escalation, dosing, region correctness, crisis response, and prompt-injection resistance; groundedness by an LLM judge (</w:t>
+        <w:t>A 42-question caregiver set was used: 32 in-scope questions (29 direct, each labelled with an expected chunk, plus three near-neighbour phrasings), four boundary questions probing unsafe specifics (drug dosing, cure claims, facility recommendations, prognosis), and six out-of-scope questions. Retrieval was scored deterministically (expected chunk within the top five) against the live database; safety by 36 deterministic checks (MUST/MUST-NOT regular-expression gates) over generations at temperature 0 with a fixed seed, covering emergency escalation, dosing, region correctness, crisis response, and prompt-injection resistance; groundedness by an LLM judge (</w:t>
       </w:r>
       <w:r>
         <w:rPr>
@@ -3181,7 +3204,7 @@
                 <w:rFonts w:ascii="Times New Roman" w:hAnsi="Times New Roman" w:cs="Times New Roman"/>
                 <w:sz w:val="20"/>
               </w:rPr>
-              <w:t>Safety assertions passed (36)</w:t>
+              <w:t>Safety checks passed (36)</w:t>
             </w:r>
           </w:p>
         </w:tc>
@@ -3322,7 +3345,7 @@
                 <w:rFonts w:ascii="Times New Roman" w:hAnsi="Times New Roman" w:cs="Times New Roman"/>
                 <w:sz w:val="20"/>
               </w:rPr>
-              <w:t>— region correctness failures (36)</w:t>
+              <w:t>— answers citing Australian services (36)</w:t>
             </w:r>
           </w:p>
         </w:tc>
@@ -3337,7 +3360,7 @@
                 <w:rFonts w:ascii="Times New Roman" w:hAnsi="Times New Roman" w:cs="Times New Roman"/>
                 <w:sz w:val="20"/>
               </w:rPr>
-              <w:t>3</w:t>
+              <w:t>2</w:t>
             </w:r>
           </w:p>
         </w:tc>
@@ -3591,7 +3614,7 @@
           <w:rFonts w:ascii="Times New Roman" w:hAnsi="Times New Roman" w:cs="Times New Roman"/>
           <w:sz w:val="24"/>
         </w:rPr>
-        <w:t xml:space="preserve"> The v1 prompt failed 8 of 36 assertions: all four emergency questions directed a New Zealand user to call 000 — the Australian emergency number — instead of 111; two dosing questions emitted specific milligram values; and three answers cited Australian services. The v2-nz-safety prompt passed 36 of 36, and all 32 in-scope generations passed their safety gates. All four boundary questions and all six out-of-scope questions were declined without unsupported specifics (five of the six retrieved nothing above the similarity floor; the sixth retrieved weak matches but still declined). The curated corpus was subsequently rewritten to be New Zealand-only; zero Australian references remain in production.</w:t>
+        <w:t xml:space="preserve"> The v1 prompt failed 8 of the 36 checks: all four emergency questions directed a New Zealand user to call 000 — the Australian emergency number — instead of 111; two dosing questions emitted specific milligram values; and two answers gave Australian services in place of the New Zealand equivalents. The v2-nz-safety prompt passed 36 of 36, and all 32 in-scope generations passed their safety gates. All four boundary questions and all six out-of-scope questions were declined without unsupported specifics (five of the six retrieved nothing above the similarity floor; the sixth retrieved weak matches but still declined). The curated corpus was subsequently rewritten to be New Zealand-only; zero Australian references remain in production.</w:t>
       </w:r>
     </w:p>
     <w:p>

</xml_diff>

<commit_message>
docs(report): fix leaked <sub> tags in co-articulation equations
The DOCX/PDF exporter (scripts/report-to-docx.py) tokenizes markdown
emphasis before HTML <sub>/<sup>, so *asterisks* inside a <sub> split the
tag and leak literal `<sub>`/`</sub>` text into the PDF (visible in eq. 2:
τ<sub>i,s</sub>, Σ<sub>i</sub>). Rewrite those atoms to the proven-working
pattern used elsewhere — italic wrapper outside, plain subscript content
(*τ<sub>i,s</sub>*, *Σ<sub>i</sub>*) — so indices render as true italic
subscripts and stay consistent with Dᵢ. Also harmonize the lone upright
τ<sub>c</sub> to italic. Rebuilt the technical-report DOCX and PDF (6 pp,
no leaked tags).

Co-Authored-By: Claude Opus 4.8 <noreply@anthropic.com>
</commit_message>
<xml_diff>
--- a/docs/report/DementiaGuide_MidYear_Technical_Report.docx
+++ b/docs/report/DementiaGuide_MidYear_Technical_Report.docx
@@ -864,7 +864,7 @@
           <w:rFonts w:ascii="Times New Roman" w:hAnsi="Times New Roman" w:cs="Times New Roman"/>
           <w:sz w:val="24"/>
         </w:rPr>
-        <w:t xml:space="preserve"> is the power-sharpened, dominance-weighted average of the active targets τ&lt;sub&gt;</w:t>
+        <w:t xml:space="preserve"> is the power-sharpened, dominance-weighted average of the active targets </w:t>
       </w:r>
       <w:r>
         <w:rPr>
@@ -872,29 +872,23 @@
           <w:i/>
           <w:sz w:val="24"/>
         </w:rPr>
-        <w:t>i</w:t>
+        <w:t>τ</w:t>
+      </w:r>
+      <w:r>
+        <w:rPr>
+          <w:rFonts w:ascii="Times New Roman" w:hAnsi="Times New Roman" w:cs="Times New Roman"/>
+          <w:i/>
+          <w:sz w:val="24"/>
+          <w:vertAlign w:val="subscript"/>
+        </w:rPr>
+        <w:t>i,s</w:t>
       </w:r>
       <w:r>
         <w:rPr>
           <w:rFonts w:ascii="Times New Roman" w:hAnsi="Times New Roman" w:cs="Times New Roman"/>
           <w:sz w:val="24"/>
         </w:rPr>
-        <w:t>,</w:t>
-      </w:r>
-      <w:r>
-        <w:rPr>
-          <w:rFonts w:ascii="Times New Roman" w:hAnsi="Times New Roman" w:cs="Times New Roman"/>
-          <w:i/>
-          <w:sz w:val="24"/>
-        </w:rPr>
-        <w:t>s</w:t>
-      </w:r>
-      <w:r>
-        <w:rPr>
-          <w:rFonts w:ascii="Times New Roman" w:hAnsi="Times New Roman" w:cs="Times New Roman"/>
-          <w:sz w:val="24"/>
-        </w:rPr>
-        <w:t>&lt;/sub&gt;:</w:t>
+        <w:t>:</w:t>
       </w:r>
     </w:p>
     <w:p>
@@ -949,13 +943,22 @@
           <w:rFonts w:ascii="Times New Roman" w:hAnsi="Times New Roman" w:cs="Times New Roman"/>
           <w:sz w:val="24"/>
         </w:rPr>
-        <w:t>) = Σ&lt;sub&gt;</w:t>
+        <w:t xml:space="preserve">) = </w:t>
       </w:r>
       <w:r>
         <w:rPr>
           <w:rFonts w:ascii="Times New Roman" w:hAnsi="Times New Roman" w:cs="Times New Roman"/>
           <w:i/>
           <w:sz w:val="24"/>
+        </w:rPr>
+        <w:t>Σ</w:t>
+      </w:r>
+      <w:r>
+        <w:rPr>
+          <w:rFonts w:ascii="Times New Roman" w:hAnsi="Times New Roman" w:cs="Times New Roman"/>
+          <w:i/>
+          <w:sz w:val="24"/>
+          <w:vertAlign w:val="subscript"/>
         </w:rPr>
         <w:t>i</w:t>
       </w:r>
@@ -964,7 +967,7 @@
           <w:rFonts w:ascii="Times New Roman" w:hAnsi="Times New Roman" w:cs="Times New Roman"/>
           <w:sz w:val="24"/>
         </w:rPr>
-        <w:t xml:space="preserve">&lt;/sub&gt; </w:t>
+        <w:t xml:space="preserve"> </w:t>
       </w:r>
       <w:r>
         <w:rPr>
@@ -1018,13 +1021,46 @@
           <w:rFonts w:ascii="Times New Roman" w:hAnsi="Times New Roman" w:cs="Times New Roman"/>
           <w:sz w:val="24"/>
         </w:rPr>
-        <w:t xml:space="preserve"> · τ&lt;sub&gt;</w:t>
+        <w:t xml:space="preserve"> · </w:t>
       </w:r>
       <w:r>
         <w:rPr>
           <w:rFonts w:ascii="Times New Roman" w:hAnsi="Times New Roman" w:cs="Times New Roman"/>
           <w:i/>
           <w:sz w:val="24"/>
+        </w:rPr>
+        <w:t>τ</w:t>
+      </w:r>
+      <w:r>
+        <w:rPr>
+          <w:rFonts w:ascii="Times New Roman" w:hAnsi="Times New Roman" w:cs="Times New Roman"/>
+          <w:i/>
+          <w:sz w:val="24"/>
+          <w:vertAlign w:val="subscript"/>
+        </w:rPr>
+        <w:t>i,s</w:t>
+      </w:r>
+      <w:r>
+        <w:rPr>
+          <w:rFonts w:ascii="Times New Roman" w:hAnsi="Times New Roman" w:cs="Times New Roman"/>
+          <w:sz w:val="24"/>
+        </w:rPr>
+        <w:t xml:space="preserve"> / max(</w:t>
+      </w:r>
+      <w:r>
+        <w:rPr>
+          <w:rFonts w:ascii="Times New Roman" w:hAnsi="Times New Roman" w:cs="Times New Roman"/>
+          <w:i/>
+          <w:sz w:val="24"/>
+        </w:rPr>
+        <w:t>Σ</w:t>
+      </w:r>
+      <w:r>
+        <w:rPr>
+          <w:rFonts w:ascii="Times New Roman" w:hAnsi="Times New Roman" w:cs="Times New Roman"/>
+          <w:i/>
+          <w:sz w:val="24"/>
+          <w:vertAlign w:val="subscript"/>
         </w:rPr>
         <w:t>i</w:t>
       </w:r>
@@ -1033,37 +1069,7 @@
           <w:rFonts w:ascii="Times New Roman" w:hAnsi="Times New Roman" w:cs="Times New Roman"/>
           <w:sz w:val="24"/>
         </w:rPr>
-        <w:t>,</w:t>
-      </w:r>
-      <w:r>
-        <w:rPr>
-          <w:rFonts w:ascii="Times New Roman" w:hAnsi="Times New Roman" w:cs="Times New Roman"/>
-          <w:i/>
-          <w:sz w:val="24"/>
-        </w:rPr>
-        <w:t>s</w:t>
-      </w:r>
-      <w:r>
-        <w:rPr>
-          <w:rFonts w:ascii="Times New Roman" w:hAnsi="Times New Roman" w:cs="Times New Roman"/>
-          <w:sz w:val="24"/>
-        </w:rPr>
-        <w:t>&lt;/sub&gt; / max(Σ&lt;sub&gt;</w:t>
-      </w:r>
-      <w:r>
-        <w:rPr>
-          <w:rFonts w:ascii="Times New Roman" w:hAnsi="Times New Roman" w:cs="Times New Roman"/>
-          <w:i/>
-          <w:sz w:val="24"/>
-        </w:rPr>
-        <w:t>i</w:t>
-      </w:r>
-      <w:r>
-        <w:rPr>
-          <w:rFonts w:ascii="Times New Roman" w:hAnsi="Times New Roman" w:cs="Times New Roman"/>
-          <w:sz w:val="24"/>
-        </w:rPr>
-        <w:t xml:space="preserve">&lt;/sub&gt; </w:t>
+        <w:t xml:space="preserve"> </w:t>
       </w:r>
       <w:r>
         <w:rPr>
@@ -1282,11 +1288,20 @@
           <w:rFonts w:ascii="Times New Roman" w:hAnsi="Times New Roman" w:cs="Times New Roman"/>
           <w:sz w:val="24"/>
         </w:rPr>
-        <w:t>) · τ</w:t>
+        <w:t xml:space="preserve">) · </w:t>
       </w:r>
       <w:r>
         <w:rPr>
           <w:rFonts w:ascii="Times New Roman" w:hAnsi="Times New Roman" w:cs="Times New Roman"/>
+          <w:i/>
+          <w:sz w:val="24"/>
+        </w:rPr>
+        <w:t>τ</w:t>
+      </w:r>
+      <w:r>
+        <w:rPr>
+          <w:rFonts w:ascii="Times New Roman" w:hAnsi="Times New Roman" w:cs="Times New Roman"/>
+          <w:i/>
           <w:sz w:val="24"/>
           <w:vertAlign w:val="subscript"/>
         </w:rPr>

</xml_diff>